<commit_message>
* Reverted Back to working Windows version, as LibreOffice didn't work. * Agentschap Hoger Onderwijs added
</commit_message>
<xml_diff>
--- a/res/Recht om te vertegenwoordigen.docx
+++ b/res/Recht om te vertegenwoordigen.docx
@@ -13,7 +13,7 @@
       </w:pPr>
       <w:r>
         <w:rPr>
-          <w:rFonts w:eastAsia="Calibri" w:cs="Times New Roman"/>
+          <w:rFonts w:ascii="Calibri" w:eastAsia="Calibri" w:hAnsi="Calibri" w:cs="Times New Roman"/>
           <w:b/>
           <w:sz w:val="24"/>
           <w:szCs w:val="24"/>
@@ -22,16 +22,16 @@
       </w:r>
       <w:r>
         <w:rPr>
-          <w:rFonts w:eastAsia="Calibri" w:cs="Times New Roman"/>
-          <w:b/>
-          <w:sz w:val="24"/>
-          <w:szCs w:val="24"/>
-        </w:rPr>
-        <w:instrText xml:space="preserve"> DATE  \@ "d/MM/yyyy" </w:instrText>
-      </w:r>
-      <w:r>
-        <w:rPr>
-          <w:rFonts w:eastAsia="Calibri" w:cs="Times New Roman"/>
+          <w:rFonts w:ascii="Calibri" w:eastAsia="Calibri" w:hAnsi="Calibri" w:cs="Times New Roman"/>
+          <w:b/>
+          <w:sz w:val="24"/>
+          <w:szCs w:val="24"/>
+        </w:rPr>
+        <w:instrText xml:space="preserve"> DATE   \* MERGEFORMAT </w:instrText>
+      </w:r>
+      <w:r>
+        <w:rPr>
+          <w:rFonts w:ascii="Calibri" w:eastAsia="Calibri" w:hAnsi="Calibri" w:cs="Times New Roman"/>
           <w:b/>
           <w:sz w:val="24"/>
           <w:szCs w:val="24"/>
@@ -40,17 +40,17 @@
       </w:r>
       <w:r>
         <w:rPr>
-          <w:rFonts w:eastAsia="Calibri" w:cs="Times New Roman"/>
+          <w:rFonts w:ascii="Calibri" w:eastAsia="Calibri" w:hAnsi="Calibri" w:cs="Times New Roman"/>
           <w:b/>
           <w:noProof/>
           <w:sz w:val="24"/>
           <w:szCs w:val="24"/>
         </w:rPr>
-        <w:t>8/01/2024</w:t>
-      </w:r>
-      <w:r>
-        <w:rPr>
-          <w:rFonts w:eastAsia="Calibri" w:cs="Times New Roman"/>
+        <w:t>20/12/2023</w:t>
+      </w:r>
+      <w:r>
+        <w:rPr>
+          <w:rFonts w:ascii="Calibri" w:eastAsia="Calibri" w:hAnsi="Calibri" w:cs="Times New Roman"/>
           <w:b/>
           <w:sz w:val="24"/>
           <w:szCs w:val="24"/>
@@ -71,7 +71,7 @@
       </w:pPr>
       <w:r>
         <w:rPr>
-          <w:rFonts w:eastAsia="Calibri" w:cs="Times New Roman"/>
+          <w:rFonts w:ascii="Calibri" w:eastAsia="Calibri" w:hAnsi="Calibri" w:cs="Times New Roman"/>
           <w:b/>
           <w:sz w:val="24"/>
           <w:szCs w:val="24"/>
@@ -92,7 +92,7 @@
       </w:pPr>
       <w:r>
         <w:rPr>
-          <w:rFonts w:eastAsia="Calibri" w:cs="Times New Roman"/>
+          <w:rFonts w:ascii="Calibri" w:eastAsia="Calibri" w:hAnsi="Calibri" w:cs="Times New Roman"/>
           <w:b/>
           <w:sz w:val="24"/>
           <w:szCs w:val="24"/>
@@ -125,7 +125,7 @@
       </w:pPr>
       <w:r>
         <w:rPr>
-          <w:rFonts w:eastAsia="Calibri" w:cs="Times New Roman"/>
+          <w:rFonts w:ascii="Calibri" w:eastAsia="Calibri" w:hAnsi="Calibri" w:cs="Times New Roman"/>
           <w:b/>
           <w:sz w:val="24"/>
           <w:szCs w:val="24"/>
@@ -134,16 +134,16 @@
       </w:r>
       <w:r>
         <w:rPr>
-          <w:rFonts w:eastAsia="Calibri" w:cs="Times New Roman"/>
-          <w:b/>
-          <w:sz w:val="24"/>
-          <w:szCs w:val="24"/>
-        </w:rPr>
-        <w:instrText xml:space="preserve"> DOCPROPERTY "Leverancier Naam"</w:instrText>
-      </w:r>
-      <w:r>
-        <w:rPr>
-          <w:rFonts w:eastAsia="Calibri" w:cs="Times New Roman"/>
+          <w:rFonts w:ascii="Calibri" w:eastAsia="Calibri" w:hAnsi="Calibri" w:cs="Times New Roman"/>
+          <w:b/>
+          <w:sz w:val="24"/>
+          <w:szCs w:val="24"/>
+        </w:rPr>
+        <w:instrText xml:space="preserve"> DOCPROPERTY  "Leverancier Naam"  \* MERGEFORMAT </w:instrText>
+      </w:r>
+      <w:r>
+        <w:rPr>
+          <w:rFonts w:ascii="Calibri" w:eastAsia="Calibri" w:hAnsi="Calibri" w:cs="Times New Roman"/>
           <w:b/>
           <w:sz w:val="24"/>
           <w:szCs w:val="24"/>
@@ -152,7 +152,7 @@
       </w:r>
       <w:r>
         <w:rPr>
-          <w:rFonts w:eastAsia="Calibri" w:cs="Times New Roman"/>
+          <w:rFonts w:ascii="Calibri" w:eastAsia="Calibri" w:hAnsi="Calibri" w:cs="Times New Roman"/>
           <w:b/>
           <w:sz w:val="24"/>
           <w:szCs w:val="24"/>
@@ -161,7 +161,7 @@
       </w:r>
       <w:r>
         <w:rPr>
-          <w:rFonts w:eastAsia="Calibri" w:cs="Times New Roman"/>
+          <w:rFonts w:ascii="Calibri" w:eastAsia="Calibri" w:hAnsi="Calibri" w:cs="Times New Roman"/>
           <w:b/>
           <w:sz w:val="24"/>
           <w:szCs w:val="24"/>
@@ -181,7 +181,7 @@
       </w:pPr>
       <w:r>
         <w:rPr>
-          <w:rFonts w:eastAsia="Calibri" w:cs="Times New Roman"/>
+          <w:rFonts w:ascii="Calibri" w:eastAsia="Calibri" w:hAnsi="Calibri" w:cs="Times New Roman"/>
           <w:sz w:val="24"/>
           <w:szCs w:val="24"/>
         </w:rPr>
@@ -189,15 +189,15 @@
       </w:r>
       <w:r>
         <w:rPr>
-          <w:rFonts w:eastAsia="Calibri" w:cs="Times New Roman"/>
-          <w:sz w:val="24"/>
-          <w:szCs w:val="24"/>
-        </w:rPr>
-        <w:instrText xml:space="preserve"> DOCPROPERTY "Leverancier Straat"</w:instrText>
-      </w:r>
-      <w:r>
-        <w:rPr>
-          <w:rFonts w:eastAsia="Calibri" w:cs="Times New Roman"/>
+          <w:rFonts w:ascii="Calibri" w:eastAsia="Calibri" w:hAnsi="Calibri" w:cs="Times New Roman"/>
+          <w:sz w:val="24"/>
+          <w:szCs w:val="24"/>
+        </w:rPr>
+        <w:instrText xml:space="preserve"> DOCPROPERTY  "Leverancier Straat"  \* MERGEFORMAT </w:instrText>
+      </w:r>
+      <w:r>
+        <w:rPr>
+          <w:rFonts w:ascii="Calibri" w:eastAsia="Calibri" w:hAnsi="Calibri" w:cs="Times New Roman"/>
           <w:sz w:val="24"/>
           <w:szCs w:val="24"/>
         </w:rPr>
@@ -205,7 +205,7 @@
       </w:r>
       <w:r>
         <w:rPr>
-          <w:rFonts w:eastAsia="Calibri" w:cs="Times New Roman"/>
+          <w:rFonts w:ascii="Calibri" w:eastAsia="Calibri" w:hAnsi="Calibri" w:cs="Times New Roman"/>
           <w:sz w:val="24"/>
           <w:szCs w:val="24"/>
         </w:rPr>
@@ -213,7 +213,7 @@
       </w:r>
       <w:r>
         <w:rPr>
-          <w:rFonts w:eastAsia="Calibri" w:cs="Times New Roman"/>
+          <w:rFonts w:ascii="Calibri" w:eastAsia="Calibri" w:hAnsi="Calibri" w:cs="Times New Roman"/>
           <w:sz w:val="24"/>
           <w:szCs w:val="24"/>
         </w:rPr>
@@ -232,7 +232,7 @@
       </w:pPr>
       <w:r>
         <w:rPr>
-          <w:rFonts w:eastAsia="Calibri" w:cs="Times New Roman"/>
+          <w:rFonts w:ascii="Calibri" w:eastAsia="Calibri" w:hAnsi="Calibri" w:cs="Times New Roman"/>
           <w:sz w:val="24"/>
           <w:szCs w:val="24"/>
         </w:rPr>
@@ -240,15 +240,15 @@
       </w:r>
       <w:r>
         <w:rPr>
-          <w:rFonts w:eastAsia="Calibri" w:cs="Times New Roman"/>
-          <w:sz w:val="24"/>
-          <w:szCs w:val="24"/>
-        </w:rPr>
-        <w:instrText xml:space="preserve"> DOCPROPERTY "Leverancier Stad"</w:instrText>
-      </w:r>
-      <w:r>
-        <w:rPr>
-          <w:rFonts w:eastAsia="Calibri" w:cs="Times New Roman"/>
+          <w:rFonts w:ascii="Calibri" w:eastAsia="Calibri" w:hAnsi="Calibri" w:cs="Times New Roman"/>
+          <w:sz w:val="24"/>
+          <w:szCs w:val="24"/>
+        </w:rPr>
+        <w:instrText xml:space="preserve"> DOCPROPERTY  "Leverancier Stad"  \* MERGEFORMAT </w:instrText>
+      </w:r>
+      <w:r>
+        <w:rPr>
+          <w:rFonts w:ascii="Calibri" w:eastAsia="Calibri" w:hAnsi="Calibri" w:cs="Times New Roman"/>
           <w:sz w:val="24"/>
           <w:szCs w:val="24"/>
         </w:rPr>
@@ -256,7 +256,7 @@
       </w:r>
       <w:r>
         <w:rPr>
-          <w:rFonts w:eastAsia="Calibri" w:cs="Times New Roman"/>
+          <w:rFonts w:ascii="Calibri" w:eastAsia="Calibri" w:hAnsi="Calibri" w:cs="Times New Roman"/>
           <w:sz w:val="24"/>
           <w:szCs w:val="24"/>
         </w:rPr>
@@ -264,7 +264,7 @@
       </w:r>
       <w:r>
         <w:rPr>
-          <w:rFonts w:eastAsia="Calibri" w:cs="Times New Roman"/>
+          <w:rFonts w:ascii="Calibri" w:eastAsia="Calibri" w:hAnsi="Calibri" w:cs="Times New Roman"/>
           <w:sz w:val="24"/>
           <w:szCs w:val="24"/>
         </w:rPr>
@@ -343,7 +343,7 @@
       </w:pPr>
       <w:r>
         <w:rPr>
-          <w:rFonts w:eastAsia="Calibri" w:cs="Calibri"/>
+          <w:rFonts w:ascii="Calibri" w:eastAsia="Calibri" w:hAnsi="Calibri" w:cs="Calibri"/>
           <w:b/>
           <w:sz w:val="28"/>
           <w:szCs w:val="28"/>
@@ -378,7 +378,7 @@
       </w:pPr>
       <w:r>
         <w:rPr>
-          <w:rFonts w:eastAsia="Calibri" w:cs="Times New Roman"/>
+          <w:rFonts w:ascii="Calibri" w:eastAsia="Calibri" w:hAnsi="Calibri" w:cs="Times New Roman"/>
           <w:sz w:val="24"/>
           <w:szCs w:val="24"/>
         </w:rPr>
@@ -386,7 +386,7 @@
       </w:r>
       <w:r>
         <w:rPr>
-          <w:rFonts w:eastAsia="Calibri" w:cs="Times New Roman"/>
+          <w:rFonts w:ascii="Calibri" w:eastAsia="Calibri" w:hAnsi="Calibri" w:cs="Times New Roman"/>
           <w:b/>
           <w:sz w:val="24"/>
           <w:szCs w:val="24"/>
@@ -395,16 +395,16 @@
       </w:r>
       <w:r>
         <w:rPr>
-          <w:rFonts w:eastAsia="Calibri" w:cs="Times New Roman"/>
-          <w:b/>
-          <w:sz w:val="24"/>
-          <w:szCs w:val="24"/>
-        </w:rPr>
-        <w:instrText xml:space="preserve"> DATE  \@ "d/MM/yyyy" </w:instrText>
-      </w:r>
-      <w:r>
-        <w:rPr>
-          <w:rFonts w:eastAsia="Calibri" w:cs="Times New Roman"/>
+          <w:rFonts w:ascii="Calibri" w:eastAsia="Calibri" w:hAnsi="Calibri" w:cs="Times New Roman"/>
+          <w:b/>
+          <w:sz w:val="24"/>
+          <w:szCs w:val="24"/>
+        </w:rPr>
+        <w:instrText xml:space="preserve"> DATE   \* MERGEFORMAT </w:instrText>
+      </w:r>
+      <w:r>
+        <w:rPr>
+          <w:rFonts w:ascii="Calibri" w:eastAsia="Calibri" w:hAnsi="Calibri" w:cs="Times New Roman"/>
           <w:b/>
           <w:sz w:val="24"/>
           <w:szCs w:val="24"/>
@@ -413,17 +413,17 @@
       </w:r>
       <w:r>
         <w:rPr>
-          <w:rFonts w:eastAsia="Calibri" w:cs="Times New Roman"/>
+          <w:rFonts w:ascii="Calibri" w:eastAsia="Calibri" w:hAnsi="Calibri" w:cs="Times New Roman"/>
           <w:b/>
           <w:noProof/>
           <w:sz w:val="24"/>
           <w:szCs w:val="24"/>
         </w:rPr>
-        <w:t>8/01/2024</w:t>
-      </w:r>
-      <w:r>
-        <w:rPr>
-          <w:rFonts w:eastAsia="Calibri" w:cs="Times New Roman"/>
+        <w:t>20/12/2023</w:t>
+      </w:r>
+      <w:r>
+        <w:rPr>
+          <w:rFonts w:ascii="Calibri" w:eastAsia="Calibri" w:hAnsi="Calibri" w:cs="Times New Roman"/>
           <w:b/>
           <w:sz w:val="24"/>
           <w:szCs w:val="24"/>
@@ -432,7 +432,7 @@
       </w:r>
       <w:r>
         <w:rPr>
-          <w:rFonts w:eastAsia="Calibri" w:cs="Times New Roman"/>
+          <w:rFonts w:ascii="Calibri" w:eastAsia="Calibri" w:hAnsi="Calibri" w:cs="Times New Roman"/>
           <w:sz w:val="24"/>
           <w:szCs w:val="24"/>
         </w:rPr>
@@ -440,16 +440,34 @@
       </w:r>
       <w:r>
         <w:rPr>
-          <w:rFonts w:eastAsia="Calibri" w:cs="Times New Roman"/>
-          <w:b/>
-          <w:sz w:val="24"/>
-          <w:szCs w:val="24"/>
-        </w:rPr>
-        <w:t>[datum]</w:t>
-      </w:r>
-      <w:r>
-        <w:rPr>
-          <w:rFonts w:eastAsia="Calibri" w:cs="Times New Roman"/>
+          <w:rFonts w:ascii="Calibri" w:eastAsia="Calibri" w:hAnsi="Calibri" w:cs="Times New Roman"/>
+          <w:b/>
+          <w:sz w:val="24"/>
+          <w:szCs w:val="24"/>
+        </w:rPr>
+        <w:t>[</w:t>
+      </w:r>
+      <w:r>
+        <w:rPr>
+          <w:rFonts w:ascii="Calibri" w:eastAsia="Calibri" w:hAnsi="Calibri" w:cs="Times New Roman"/>
+          <w:b/>
+          <w:sz w:val="24"/>
+          <w:szCs w:val="24"/>
+        </w:rPr>
+        <w:t>datum</w:t>
+      </w:r>
+      <w:r>
+        <w:rPr>
+          <w:rFonts w:ascii="Calibri" w:eastAsia="Calibri" w:hAnsi="Calibri" w:cs="Times New Roman"/>
+          <w:b/>
+          <w:sz w:val="24"/>
+          <w:szCs w:val="24"/>
+        </w:rPr>
+        <w:t>]</w:t>
+      </w:r>
+      <w:r>
+        <w:rPr>
+          <w:rFonts w:ascii="Calibri" w:eastAsia="Calibri" w:hAnsi="Calibri" w:cs="Times New Roman"/>
           <w:sz w:val="24"/>
           <w:szCs w:val="24"/>
         </w:rPr>
@@ -458,7 +476,7 @@
       <w:bookmarkStart w:id="0" w:name="_Hlk46741752"/>
       <w:r>
         <w:rPr>
-          <w:rFonts w:eastAsia="Calibri" w:cs="Times New Roman"/>
+          <w:rFonts w:ascii="Calibri" w:eastAsia="Calibri" w:hAnsi="Calibri" w:cs="Times New Roman"/>
           <w:b/>
           <w:sz w:val="24"/>
           <w:szCs w:val="24"/>
@@ -467,16 +485,16 @@
       </w:r>
       <w:r>
         <w:rPr>
-          <w:rFonts w:eastAsia="Calibri" w:cs="Times New Roman"/>
-          <w:b/>
-          <w:sz w:val="24"/>
-          <w:szCs w:val="24"/>
-        </w:rPr>
-        <w:instrText xml:space="preserve"> DOCPROPERTY "Leverancier Naam"</w:instrText>
-      </w:r>
-      <w:r>
-        <w:rPr>
-          <w:rFonts w:eastAsia="Calibri" w:cs="Times New Roman"/>
+          <w:rFonts w:ascii="Calibri" w:eastAsia="Calibri" w:hAnsi="Calibri" w:cs="Times New Roman"/>
+          <w:b/>
+          <w:sz w:val="24"/>
+          <w:szCs w:val="24"/>
+        </w:rPr>
+        <w:instrText xml:space="preserve"> DOCPROPERTY  "Leverancier Naam"  \* MERGEFORMAT </w:instrText>
+      </w:r>
+      <w:r>
+        <w:rPr>
+          <w:rFonts w:ascii="Calibri" w:eastAsia="Calibri" w:hAnsi="Calibri" w:cs="Times New Roman"/>
           <w:b/>
           <w:sz w:val="24"/>
           <w:szCs w:val="24"/>
@@ -485,7 +503,7 @@
       </w:r>
       <w:r>
         <w:rPr>
-          <w:rFonts w:eastAsia="Calibri" w:cs="Times New Roman"/>
+          <w:rFonts w:ascii="Calibri" w:eastAsia="Calibri" w:hAnsi="Calibri" w:cs="Times New Roman"/>
           <w:b/>
           <w:sz w:val="24"/>
           <w:szCs w:val="24"/>
@@ -494,7 +512,7 @@
       </w:r>
       <w:r>
         <w:rPr>
-          <w:rFonts w:eastAsia="Calibri" w:cs="Times New Roman"/>
+          <w:rFonts w:ascii="Calibri" w:eastAsia="Calibri" w:hAnsi="Calibri" w:cs="Times New Roman"/>
           <w:b/>
           <w:sz w:val="24"/>
           <w:szCs w:val="24"/>
@@ -504,7 +522,7 @@
       <w:bookmarkEnd w:id="0"/>
       <w:r>
         <w:rPr>
-          <w:rFonts w:eastAsia="Calibri" w:cs="Times New Roman"/>
+          <w:rFonts w:ascii="Calibri" w:eastAsia="Calibri" w:hAnsi="Calibri" w:cs="Times New Roman"/>
           <w:b/>
           <w:sz w:val="24"/>
           <w:szCs w:val="24"/>
@@ -513,7 +531,7 @@
       </w:r>
       <w:r>
         <w:rPr>
-          <w:rFonts w:eastAsia="Calibri" w:cs="Times New Roman"/>
+          <w:rFonts w:ascii="Calibri" w:eastAsia="Calibri" w:hAnsi="Calibri" w:cs="Times New Roman"/>
           <w:bCs/>
           <w:sz w:val="24"/>
           <w:szCs w:val="24"/>
@@ -522,15 +540,23 @@
       </w:r>
       <w:r>
         <w:rPr>
-          <w:rFonts w:eastAsia="Calibri" w:cs="Times New Roman"/>
-          <w:sz w:val="24"/>
-          <w:szCs w:val="24"/>
-        </w:rPr>
-        <w:t xml:space="preserve">, gevestigd te </w:t>
-      </w:r>
-      <w:r>
-        <w:rPr>
-          <w:rFonts w:eastAsia="Calibri" w:cs="Times New Roman"/>
+          <w:rFonts w:ascii="Calibri" w:eastAsia="Calibri" w:hAnsi="Calibri" w:cs="Times New Roman"/>
+          <w:sz w:val="24"/>
+          <w:szCs w:val="24"/>
+        </w:rPr>
+        <w:t>,</w:t>
+      </w:r>
+      <w:r>
+        <w:rPr>
+          <w:rFonts w:ascii="Calibri" w:eastAsia="Calibri" w:hAnsi="Calibri" w:cs="Times New Roman"/>
+          <w:sz w:val="24"/>
+          <w:szCs w:val="24"/>
+        </w:rPr>
+        <w:t xml:space="preserve"> gevestigd te </w:t>
+      </w:r>
+      <w:r>
+        <w:rPr>
+          <w:rFonts w:ascii="Calibri" w:eastAsia="Calibri" w:hAnsi="Calibri" w:cs="Times New Roman"/>
           <w:b/>
           <w:sz w:val="24"/>
           <w:szCs w:val="24"/>
@@ -539,16 +565,16 @@
       </w:r>
       <w:r>
         <w:rPr>
-          <w:rFonts w:eastAsia="Calibri" w:cs="Times New Roman"/>
-          <w:b/>
-          <w:sz w:val="24"/>
-          <w:szCs w:val="24"/>
-        </w:rPr>
-        <w:instrText xml:space="preserve"> DOCPROPERTY "Leverancier Postadres"</w:instrText>
-      </w:r>
-      <w:r>
-        <w:rPr>
-          <w:rFonts w:eastAsia="Calibri" w:cs="Times New Roman"/>
+          <w:rFonts w:ascii="Calibri" w:eastAsia="Calibri" w:hAnsi="Calibri" w:cs="Times New Roman"/>
+          <w:b/>
+          <w:sz w:val="24"/>
+          <w:szCs w:val="24"/>
+        </w:rPr>
+        <w:instrText xml:space="preserve"> DOCPROPERTY  "Leverancier Postadres"  \* MERGEFORMAT </w:instrText>
+      </w:r>
+      <w:r>
+        <w:rPr>
+          <w:rFonts w:ascii="Calibri" w:eastAsia="Calibri" w:hAnsi="Calibri" w:cs="Times New Roman"/>
           <w:b/>
           <w:sz w:val="24"/>
           <w:szCs w:val="24"/>
@@ -557,7 +583,7 @@
       </w:r>
       <w:r>
         <w:rPr>
-          <w:rFonts w:eastAsia="Calibri" w:cs="Times New Roman"/>
+          <w:rFonts w:ascii="Calibri" w:eastAsia="Calibri" w:hAnsi="Calibri" w:cs="Times New Roman"/>
           <w:b/>
           <w:sz w:val="24"/>
           <w:szCs w:val="24"/>
@@ -566,7 +592,7 @@
       </w:r>
       <w:r>
         <w:rPr>
-          <w:rFonts w:eastAsia="Calibri" w:cs="Times New Roman"/>
+          <w:rFonts w:ascii="Calibri" w:eastAsia="Calibri" w:hAnsi="Calibri" w:cs="Times New Roman"/>
           <w:b/>
           <w:sz w:val="24"/>
           <w:szCs w:val="24"/>
@@ -575,7 +601,7 @@
       </w:r>
       <w:r>
         <w:rPr>
-          <w:rFonts w:eastAsia="Calibri" w:cs="Times New Roman"/>
+          <w:rFonts w:ascii="Calibri" w:eastAsia="Calibri" w:hAnsi="Calibri" w:cs="Times New Roman"/>
           <w:b/>
           <w:sz w:val="24"/>
           <w:szCs w:val="24"/>
@@ -584,7 +610,7 @@
       </w:r>
       <w:r>
         <w:rPr>
-          <w:rFonts w:eastAsia="Calibri" w:cs="Times New Roman"/>
+          <w:rFonts w:ascii="Calibri" w:eastAsia="Calibri" w:hAnsi="Calibri" w:cs="Times New Roman"/>
           <w:bCs/>
           <w:sz w:val="24"/>
           <w:szCs w:val="24"/>
@@ -593,7 +619,7 @@
       </w:r>
       <w:r>
         <w:rPr>
-          <w:rFonts w:eastAsia="Calibri" w:cs="Times New Roman"/>
+          <w:rFonts w:ascii="Calibri" w:eastAsia="Calibri" w:hAnsi="Calibri" w:cs="Times New Roman"/>
           <w:sz w:val="24"/>
           <w:szCs w:val="24"/>
         </w:rPr>
@@ -601,7 +627,7 @@
       </w:r>
       <w:r>
         <w:rPr>
-          <w:rFonts w:eastAsia="Calibri" w:cs="Times New Roman"/>
+          <w:rFonts w:ascii="Calibri" w:eastAsia="Calibri" w:hAnsi="Calibri" w:cs="Times New Roman"/>
           <w:sz w:val="24"/>
           <w:szCs w:val="24"/>
         </w:rPr>
@@ -609,7 +635,7 @@
       </w:r>
       <w:r>
         <w:rPr>
-          <w:rFonts w:eastAsia="Calibri" w:cs="Times New Roman"/>
+          <w:rFonts w:ascii="Calibri" w:eastAsia="Calibri" w:hAnsi="Calibri" w:cs="Times New Roman"/>
           <w:b/>
           <w:bCs/>
           <w:sz w:val="24"/>
@@ -619,17 +645,17 @@
       </w:r>
       <w:r>
         <w:rPr>
-          <w:rFonts w:eastAsia="Calibri" w:cs="Times New Roman"/>
-          <w:b/>
-          <w:bCs/>
-          <w:sz w:val="24"/>
-          <w:szCs w:val="24"/>
-        </w:rPr>
-        <w:instrText xml:space="preserve"> DOCPROPERTY "Leverancier Kandidaat"</w:instrText>
-      </w:r>
-      <w:r>
-        <w:rPr>
-          <w:rFonts w:eastAsia="Calibri" w:cs="Times New Roman"/>
+          <w:rFonts w:ascii="Calibri" w:eastAsia="Calibri" w:hAnsi="Calibri" w:cs="Times New Roman"/>
+          <w:b/>
+          <w:bCs/>
+          <w:sz w:val="24"/>
+          <w:szCs w:val="24"/>
+        </w:rPr>
+        <w:instrText xml:space="preserve"> DOCPROPERTY  "Leverancier Kandidaat"  \* MERGEFORMAT </w:instrText>
+      </w:r>
+      <w:r>
+        <w:rPr>
+          <w:rFonts w:ascii="Calibri" w:eastAsia="Calibri" w:hAnsi="Calibri" w:cs="Times New Roman"/>
           <w:b/>
           <w:bCs/>
           <w:sz w:val="24"/>
@@ -639,7 +665,7 @@
       </w:r>
       <w:r>
         <w:rPr>
-          <w:rFonts w:eastAsia="Calibri" w:cs="Times New Roman"/>
+          <w:rFonts w:ascii="Calibri" w:eastAsia="Calibri" w:hAnsi="Calibri" w:cs="Times New Roman"/>
           <w:b/>
           <w:bCs/>
           <w:sz w:val="24"/>
@@ -649,7 +675,7 @@
       </w:r>
       <w:r>
         <w:rPr>
-          <w:rFonts w:eastAsia="Calibri" w:cs="Times New Roman"/>
+          <w:rFonts w:ascii="Calibri" w:eastAsia="Calibri" w:hAnsi="Calibri" w:cs="Times New Roman"/>
           <w:b/>
           <w:bCs/>
           <w:sz w:val="24"/>
@@ -659,17 +685,27 @@
       </w:r>
       <w:r>
         <w:rPr>
-          <w:rFonts w:eastAsia="Calibri" w:cs="Times New Roman"/>
-          <w:b/>
-          <w:bCs/>
-          <w:sz w:val="24"/>
-          <w:szCs w:val="24"/>
-        </w:rPr>
-        <w:t xml:space="preserve">  </w:t>
-      </w:r>
-      <w:r>
-        <w:rPr>
-          <w:rFonts w:eastAsia="Calibri" w:cs="Times New Roman"/>
+          <w:rFonts w:ascii="Calibri" w:eastAsia="Calibri" w:hAnsi="Calibri" w:cs="Times New Roman"/>
+          <w:b/>
+          <w:bCs/>
+          <w:sz w:val="24"/>
+          <w:szCs w:val="24"/>
+        </w:rPr>
+        <w:t xml:space="preserve"> </w:t>
+      </w:r>
+      <w:r>
+        <w:rPr>
+          <w:rFonts w:ascii="Calibri" w:eastAsia="Calibri" w:hAnsi="Calibri" w:cs="Times New Roman"/>
+          <w:b/>
+          <w:bCs/>
+          <w:sz w:val="24"/>
+          <w:szCs w:val="24"/>
+        </w:rPr>
+        <w:t xml:space="preserve"> </w:t>
+      </w:r>
+      <w:r>
+        <w:rPr>
+          <w:rFonts w:ascii="Calibri" w:eastAsia="Calibri" w:hAnsi="Calibri" w:cs="Times New Roman"/>
           <w:bCs/>
           <w:sz w:val="24"/>
           <w:szCs w:val="24"/>
@@ -678,15 +714,31 @@
       </w:r>
       <w:r>
         <w:rPr>
-          <w:rFonts w:eastAsia="Calibri" w:cs="Times New Roman"/>
-          <w:sz w:val="24"/>
-          <w:szCs w:val="24"/>
-        </w:rPr>
-        <w:t xml:space="preserve"> (in hoedanigheid van </w:t>
-      </w:r>
-      <w:r>
-        <w:rPr>
-          <w:rFonts w:eastAsia="Calibri" w:cs="Times New Roman"/>
+          <w:rFonts w:ascii="Calibri" w:eastAsia="Calibri" w:hAnsi="Calibri" w:cs="Times New Roman"/>
+          <w:sz w:val="24"/>
+          <w:szCs w:val="24"/>
+        </w:rPr>
+        <w:t xml:space="preserve"> (</w:t>
+      </w:r>
+      <w:r>
+        <w:rPr>
+          <w:rFonts w:ascii="Calibri" w:eastAsia="Calibri" w:hAnsi="Calibri" w:cs="Times New Roman"/>
+          <w:sz w:val="24"/>
+          <w:szCs w:val="24"/>
+        </w:rPr>
+        <w:t>in hoedanigheid van</w:t>
+      </w:r>
+      <w:r>
+        <w:rPr>
+          <w:rFonts w:ascii="Calibri" w:eastAsia="Calibri" w:hAnsi="Calibri" w:cs="Times New Roman"/>
+          <w:sz w:val="24"/>
+          <w:szCs w:val="24"/>
+        </w:rPr>
+        <w:t xml:space="preserve"> </w:t>
+      </w:r>
+      <w:r>
+        <w:rPr>
+          <w:rFonts w:ascii="Calibri" w:eastAsia="Calibri" w:hAnsi="Calibri" w:cs="Times New Roman"/>
           <w:b/>
           <w:sz w:val="24"/>
           <w:szCs w:val="24"/>
@@ -695,16 +747,16 @@
       </w:r>
       <w:r>
         <w:rPr>
-          <w:rFonts w:eastAsia="Calibri" w:cs="Times New Roman"/>
-          <w:b/>
-          <w:sz w:val="24"/>
-          <w:szCs w:val="24"/>
-        </w:rPr>
-        <w:instrText xml:space="preserve"> DOCPROPERTY "Leverancier Hoedanigheid"</w:instrText>
-      </w:r>
-      <w:r>
-        <w:rPr>
-          <w:rFonts w:eastAsia="Calibri" w:cs="Times New Roman"/>
+          <w:rFonts w:ascii="Calibri" w:eastAsia="Calibri" w:hAnsi="Calibri" w:cs="Times New Roman"/>
+          <w:b/>
+          <w:sz w:val="24"/>
+          <w:szCs w:val="24"/>
+        </w:rPr>
+        <w:instrText xml:space="preserve"> DOCPROPERTY  "Leverancier Hoedanigheid"  \* MERGEFORMAT </w:instrText>
+      </w:r>
+      <w:r>
+        <w:rPr>
+          <w:rFonts w:ascii="Calibri" w:eastAsia="Calibri" w:hAnsi="Calibri" w:cs="Times New Roman"/>
           <w:b/>
           <w:sz w:val="24"/>
           <w:szCs w:val="24"/>
@@ -713,7 +765,7 @@
       </w:r>
       <w:r>
         <w:rPr>
-          <w:rFonts w:eastAsia="Calibri" w:cs="Times New Roman"/>
+          <w:rFonts w:ascii="Calibri" w:eastAsia="Calibri" w:hAnsi="Calibri" w:cs="Times New Roman"/>
           <w:b/>
           <w:sz w:val="24"/>
           <w:szCs w:val="24"/>
@@ -722,7 +774,7 @@
       </w:r>
       <w:r>
         <w:rPr>
-          <w:rFonts w:eastAsia="Calibri" w:cs="Times New Roman"/>
+          <w:rFonts w:ascii="Calibri" w:eastAsia="Calibri" w:hAnsi="Calibri" w:cs="Times New Roman"/>
           <w:b/>
           <w:sz w:val="24"/>
           <w:szCs w:val="24"/>
@@ -731,7 +783,7 @@
       </w:r>
       <w:r>
         <w:rPr>
-          <w:rFonts w:eastAsia="Calibri" w:cs="Times New Roman"/>
+          <w:rFonts w:ascii="Calibri" w:eastAsia="Calibri" w:hAnsi="Calibri" w:cs="Times New Roman"/>
           <w:b/>
           <w:sz w:val="24"/>
           <w:szCs w:val="24"/>
@@ -740,16 +792,34 @@
       </w:r>
       <w:r>
         <w:rPr>
-          <w:rFonts w:eastAsia="Calibri" w:cs="Times New Roman"/>
-          <w:bCs/>
-          <w:sz w:val="24"/>
-          <w:szCs w:val="24"/>
-        </w:rPr>
-        <w:t>[directe werknemer, directe freelancer, werknemer in onderaanneming, freelancer in onderaanneming]</w:t>
-      </w:r>
-      <w:r>
-        <w:rPr>
-          <w:rFonts w:eastAsia="Calibri" w:cs="Times New Roman"/>
+          <w:rFonts w:ascii="Calibri" w:eastAsia="Calibri" w:hAnsi="Calibri" w:cs="Times New Roman"/>
+          <w:bCs/>
+          <w:sz w:val="24"/>
+          <w:szCs w:val="24"/>
+        </w:rPr>
+        <w:t>[</w:t>
+      </w:r>
+      <w:r>
+        <w:rPr>
+          <w:rFonts w:ascii="Calibri" w:eastAsia="Calibri" w:hAnsi="Calibri" w:cs="Times New Roman"/>
+          <w:bCs/>
+          <w:sz w:val="24"/>
+          <w:szCs w:val="24"/>
+        </w:rPr>
+        <w:t>directe werknemer, directe freelancer, werknemer in onderaanneming, freelancer in onderaanneming</w:t>
+      </w:r>
+      <w:r>
+        <w:rPr>
+          <w:rFonts w:ascii="Calibri" w:eastAsia="Calibri" w:hAnsi="Calibri" w:cs="Times New Roman"/>
+          <w:bCs/>
+          <w:sz w:val="24"/>
+          <w:szCs w:val="24"/>
+        </w:rPr>
+        <w:t>]</w:t>
+      </w:r>
+      <w:r>
+        <w:rPr>
+          <w:rFonts w:ascii="Calibri" w:eastAsia="Calibri" w:hAnsi="Calibri" w:cs="Times New Roman"/>
           <w:sz w:val="24"/>
           <w:szCs w:val="24"/>
         </w:rPr>
@@ -767,15 +837,23 @@
       </w:pPr>
       <w:r>
         <w:rPr>
-          <w:rFonts w:eastAsia="Calibri" w:cs="Times New Roman"/>
-          <w:sz w:val="24"/>
-          <w:szCs w:val="24"/>
-        </w:rPr>
-        <w:t xml:space="preserve">De contractor geeft </w:t>
-      </w:r>
-      <w:r>
-        <w:rPr>
-          <w:rFonts w:eastAsia="Calibri" w:cs="Times New Roman"/>
+          <w:rFonts w:ascii="Calibri" w:eastAsia="Calibri" w:hAnsi="Calibri" w:cs="Times New Roman"/>
+          <w:sz w:val="24"/>
+          <w:szCs w:val="24"/>
+        </w:rPr>
+        <w:t>De</w:t>
+      </w:r>
+      <w:r>
+        <w:rPr>
+          <w:rFonts w:ascii="Calibri" w:eastAsia="Calibri" w:hAnsi="Calibri" w:cs="Times New Roman"/>
+          <w:sz w:val="24"/>
+          <w:szCs w:val="24"/>
+        </w:rPr>
+        <w:t xml:space="preserve"> contractor geeft </w:t>
+      </w:r>
+      <w:r>
+        <w:rPr>
+          <w:rFonts w:ascii="Calibri" w:eastAsia="Calibri" w:hAnsi="Calibri" w:cs="Times New Roman"/>
           <w:b/>
           <w:sz w:val="24"/>
           <w:szCs w:val="24"/>
@@ -784,16 +862,16 @@
       </w:r>
       <w:r>
         <w:rPr>
-          <w:rFonts w:eastAsia="Calibri" w:cs="Times New Roman"/>
-          <w:b/>
-          <w:sz w:val="24"/>
-          <w:szCs w:val="24"/>
-        </w:rPr>
-        <w:instrText xml:space="preserve"> DOCPROPERTY "Leverancier Naam"</w:instrText>
-      </w:r>
-      <w:r>
-        <w:rPr>
-          <w:rFonts w:eastAsia="Calibri" w:cs="Times New Roman"/>
+          <w:rFonts w:ascii="Calibri" w:eastAsia="Calibri" w:hAnsi="Calibri" w:cs="Times New Roman"/>
+          <w:b/>
+          <w:sz w:val="24"/>
+          <w:szCs w:val="24"/>
+        </w:rPr>
+        <w:instrText xml:space="preserve"> DOCPROPERTY  "Leverancier Naam"  \* MERGEFORMAT </w:instrText>
+      </w:r>
+      <w:r>
+        <w:rPr>
+          <w:rFonts w:ascii="Calibri" w:eastAsia="Calibri" w:hAnsi="Calibri" w:cs="Times New Roman"/>
           <w:b/>
           <w:sz w:val="24"/>
           <w:szCs w:val="24"/>
@@ -802,7 +880,7 @@
       </w:r>
       <w:r>
         <w:rPr>
-          <w:rFonts w:eastAsia="Calibri" w:cs="Times New Roman"/>
+          <w:rFonts w:ascii="Calibri" w:eastAsia="Calibri" w:hAnsi="Calibri" w:cs="Times New Roman"/>
           <w:b/>
           <w:sz w:val="24"/>
           <w:szCs w:val="24"/>
@@ -811,7 +889,7 @@
       </w:r>
       <w:r>
         <w:rPr>
-          <w:rFonts w:eastAsia="Calibri" w:cs="Times New Roman"/>
+          <w:rFonts w:ascii="Calibri" w:eastAsia="Calibri" w:hAnsi="Calibri" w:cs="Times New Roman"/>
           <w:b/>
           <w:sz w:val="24"/>
           <w:szCs w:val="24"/>
@@ -820,15 +898,31 @@
       </w:r>
       <w:r>
         <w:rPr>
-          <w:rFonts w:eastAsia="Calibri" w:cs="Times New Roman"/>
-          <w:sz w:val="24"/>
-          <w:szCs w:val="24"/>
-        </w:rPr>
-        <w:t xml:space="preserve"> de toestemming om zijn/haar CV voor te stellen en zijn/haar belang te vertegenwoordigen voor de aanvraag van </w:t>
-      </w:r>
-      <w:r>
-        <w:rPr>
-          <w:rFonts w:eastAsia="Calibri" w:cs="Times New Roman"/>
+          <w:rFonts w:ascii="Calibri" w:eastAsia="Calibri" w:hAnsi="Calibri" w:cs="Times New Roman"/>
+          <w:sz w:val="24"/>
+          <w:szCs w:val="24"/>
+        </w:rPr>
+        <w:t xml:space="preserve"> de toestemming om zijn/haar CV</w:t>
+      </w:r>
+      <w:r>
+        <w:rPr>
+          <w:rFonts w:ascii="Calibri" w:eastAsia="Calibri" w:hAnsi="Calibri" w:cs="Times New Roman"/>
+          <w:sz w:val="24"/>
+          <w:szCs w:val="24"/>
+        </w:rPr>
+        <w:t xml:space="preserve"> voor te stellen </w:t>
+      </w:r>
+      <w:r>
+        <w:rPr>
+          <w:rFonts w:ascii="Calibri" w:eastAsia="Calibri" w:hAnsi="Calibri" w:cs="Times New Roman"/>
+          <w:sz w:val="24"/>
+          <w:szCs w:val="24"/>
+        </w:rPr>
+        <w:t xml:space="preserve">en zijn/haar belang te vertegenwoordigen voor de aanvraag van </w:t>
+      </w:r>
+      <w:r>
+        <w:rPr>
+          <w:rFonts w:ascii="Calibri" w:eastAsia="Calibri" w:hAnsi="Calibri" w:cs="Times New Roman"/>
           <w:b/>
           <w:bCs/>
           <w:sz w:val="24"/>
@@ -838,7 +932,7 @@
       </w:r>
       <w:r>
         <w:rPr>
-          <w:rFonts w:eastAsia="Calibri" w:cs="Times New Roman"/>
+          <w:rFonts w:ascii="Calibri" w:eastAsia="Calibri" w:hAnsi="Calibri" w:cs="Times New Roman"/>
           <w:b/>
           <w:bCs/>
           <w:sz w:val="24"/>
@@ -848,17 +942,17 @@
       </w:r>
       <w:r>
         <w:rPr>
-          <w:rFonts w:eastAsia="Calibri" w:cs="Times New Roman"/>
-          <w:b/>
-          <w:bCs/>
-          <w:sz w:val="24"/>
-          <w:szCs w:val="24"/>
-        </w:rPr>
-        <w:instrText xml:space="preserve"> DOCPROPERTY "Klant Naam"</w:instrText>
-      </w:r>
-      <w:r>
-        <w:rPr>
-          <w:rFonts w:eastAsia="Calibri" w:cs="Times New Roman"/>
+          <w:rFonts w:ascii="Calibri" w:eastAsia="Calibri" w:hAnsi="Calibri" w:cs="Times New Roman"/>
+          <w:b/>
+          <w:bCs/>
+          <w:sz w:val="24"/>
+          <w:szCs w:val="24"/>
+        </w:rPr>
+        <w:instrText xml:space="preserve"> DOCPROPERTY  "Klant Naam"  \* MERGEFORMAT </w:instrText>
+      </w:r>
+      <w:r>
+        <w:rPr>
+          <w:rFonts w:ascii="Calibri" w:eastAsia="Calibri" w:hAnsi="Calibri" w:cs="Times New Roman"/>
           <w:b/>
           <w:bCs/>
           <w:sz w:val="24"/>
@@ -868,7 +962,7 @@
       </w:r>
       <w:r>
         <w:rPr>
-          <w:rFonts w:eastAsia="Calibri" w:cs="Times New Roman"/>
+          <w:rFonts w:ascii="Calibri" w:eastAsia="Calibri" w:hAnsi="Calibri" w:cs="Times New Roman"/>
           <w:b/>
           <w:bCs/>
           <w:sz w:val="24"/>
@@ -878,7 +972,7 @@
       </w:r>
       <w:r>
         <w:rPr>
-          <w:rFonts w:eastAsia="Calibri" w:cs="Times New Roman"/>
+          <w:rFonts w:ascii="Calibri" w:eastAsia="Calibri" w:hAnsi="Calibri" w:cs="Times New Roman"/>
           <w:b/>
           <w:bCs/>
           <w:sz w:val="24"/>
@@ -888,7 +982,7 @@
       </w:r>
       <w:r>
         <w:rPr>
-          <w:rFonts w:eastAsia="Calibri" w:cs="Times New Roman"/>
+          <w:rFonts w:ascii="Calibri" w:eastAsia="Calibri" w:hAnsi="Calibri" w:cs="Times New Roman"/>
           <w:b/>
           <w:sz w:val="24"/>
           <w:szCs w:val="24"/>
@@ -897,7 +991,7 @@
       </w:r>
       <w:r>
         <w:rPr>
-          <w:rFonts w:eastAsia="Calibri" w:cs="Times New Roman"/>
+          <w:rFonts w:ascii="Calibri" w:eastAsia="Calibri" w:hAnsi="Calibri" w:cs="Times New Roman"/>
           <w:bCs/>
           <w:sz w:val="24"/>
           <w:szCs w:val="24"/>
@@ -906,7 +1000,7 @@
       </w:r>
       <w:r>
         <w:rPr>
-          <w:rFonts w:eastAsia="Calibri" w:cs="Times New Roman"/>
+          <w:rFonts w:ascii="Calibri" w:eastAsia="Calibri" w:hAnsi="Calibri" w:cs="Times New Roman"/>
           <w:sz w:val="24"/>
           <w:szCs w:val="24"/>
         </w:rPr>
@@ -914,7 +1008,7 @@
       </w:r>
       <w:r>
         <w:rPr>
-          <w:rFonts w:eastAsia="Calibri" w:cs="Times New Roman"/>
+          <w:rFonts w:ascii="Calibri" w:eastAsia="Calibri" w:hAnsi="Calibri" w:cs="Times New Roman"/>
           <w:b/>
           <w:bCs/>
           <w:sz w:val="24"/>
@@ -924,17 +1018,17 @@
       </w:r>
       <w:r>
         <w:rPr>
-          <w:rFonts w:eastAsia="Calibri" w:cs="Times New Roman"/>
-          <w:b/>
-          <w:bCs/>
-          <w:sz w:val="24"/>
-          <w:szCs w:val="24"/>
-        </w:rPr>
-        <w:instrText xml:space="preserve"> DOCPROPERTY "Klant JobReference"</w:instrText>
-      </w:r>
-      <w:r>
-        <w:rPr>
-          <w:rFonts w:eastAsia="Calibri" w:cs="Times New Roman"/>
+          <w:rFonts w:ascii="Calibri" w:eastAsia="Calibri" w:hAnsi="Calibri" w:cs="Times New Roman"/>
+          <w:b/>
+          <w:bCs/>
+          <w:sz w:val="24"/>
+          <w:szCs w:val="24"/>
+        </w:rPr>
+        <w:instrText xml:space="preserve"> DOCPROPERTY  "Klant JobReference"  \* MERGEFORMAT </w:instrText>
+      </w:r>
+      <w:r>
+        <w:rPr>
+          <w:rFonts w:ascii="Calibri" w:eastAsia="Calibri" w:hAnsi="Calibri" w:cs="Times New Roman"/>
           <w:b/>
           <w:bCs/>
           <w:sz w:val="24"/>
@@ -944,7 +1038,7 @@
       </w:r>
       <w:r>
         <w:rPr>
-          <w:rFonts w:eastAsia="Calibri" w:cs="Times New Roman"/>
+          <w:rFonts w:ascii="Calibri" w:eastAsia="Calibri" w:hAnsi="Calibri" w:cs="Times New Roman"/>
           <w:b/>
           <w:bCs/>
           <w:sz w:val="24"/>
@@ -954,7 +1048,7 @@
       </w:r>
       <w:r>
         <w:rPr>
-          <w:rFonts w:eastAsia="Calibri" w:cs="Times New Roman"/>
+          <w:rFonts w:ascii="Calibri" w:eastAsia="Calibri" w:hAnsi="Calibri" w:cs="Times New Roman"/>
           <w:b/>
           <w:bCs/>
           <w:sz w:val="24"/>
@@ -964,17 +1058,27 @@
       </w:r>
       <w:r>
         <w:rPr>
-          <w:rFonts w:eastAsia="Calibri" w:cs="Times New Roman"/>
-          <w:b/>
-          <w:bCs/>
-          <w:sz w:val="24"/>
-          <w:szCs w:val="24"/>
-        </w:rPr>
-        <w:t xml:space="preserve"> (</w:t>
-      </w:r>
-      <w:r>
-        <w:rPr>
-          <w:rFonts w:eastAsia="Calibri" w:cs="Times New Roman"/>
+          <w:rFonts w:ascii="Calibri" w:eastAsia="Calibri" w:hAnsi="Calibri" w:cs="Times New Roman"/>
+          <w:b/>
+          <w:bCs/>
+          <w:sz w:val="24"/>
+          <w:szCs w:val="24"/>
+        </w:rPr>
+        <w:t xml:space="preserve"> </w:t>
+      </w:r>
+      <w:r>
+        <w:rPr>
+          <w:rFonts w:ascii="Calibri" w:eastAsia="Calibri" w:hAnsi="Calibri" w:cs="Times New Roman"/>
+          <w:b/>
+          <w:bCs/>
+          <w:sz w:val="24"/>
+          <w:szCs w:val="24"/>
+        </w:rPr>
+        <w:t>(</w:t>
+      </w:r>
+      <w:r>
+        <w:rPr>
+          <w:rFonts w:ascii="Calibri" w:eastAsia="Calibri" w:hAnsi="Calibri" w:cs="Times New Roman"/>
           <w:b/>
           <w:bCs/>
           <w:sz w:val="24"/>
@@ -984,17 +1088,17 @@
       </w:r>
       <w:r>
         <w:rPr>
-          <w:rFonts w:eastAsia="Calibri" w:cs="Times New Roman"/>
-          <w:b/>
-          <w:bCs/>
-          <w:sz w:val="24"/>
-          <w:szCs w:val="24"/>
-        </w:rPr>
-        <w:instrText xml:space="preserve"> DOCPROPERTY "Klant JobTitle"</w:instrText>
-      </w:r>
-      <w:r>
-        <w:rPr>
-          <w:rFonts w:eastAsia="Calibri" w:cs="Times New Roman"/>
+          <w:rFonts w:ascii="Calibri" w:eastAsia="Calibri" w:hAnsi="Calibri" w:cs="Times New Roman"/>
+          <w:b/>
+          <w:bCs/>
+          <w:sz w:val="24"/>
+          <w:szCs w:val="24"/>
+        </w:rPr>
+        <w:instrText xml:space="preserve"> DOCPROPERTY  "Klant JobTitle"  \* MERGEFORMAT </w:instrText>
+      </w:r>
+      <w:r>
+        <w:rPr>
+          <w:rFonts w:ascii="Calibri" w:eastAsia="Calibri" w:hAnsi="Calibri" w:cs="Times New Roman"/>
           <w:b/>
           <w:bCs/>
           <w:sz w:val="24"/>
@@ -1004,7 +1108,7 @@
       </w:r>
       <w:r>
         <w:rPr>
-          <w:rFonts w:eastAsia="Calibri" w:cs="Times New Roman"/>
+          <w:rFonts w:ascii="Calibri" w:eastAsia="Calibri" w:hAnsi="Calibri" w:cs="Times New Roman"/>
           <w:b/>
           <w:bCs/>
           <w:sz w:val="24"/>
@@ -1014,7 +1118,7 @@
       </w:r>
       <w:r>
         <w:rPr>
-          <w:rFonts w:eastAsia="Calibri" w:cs="Times New Roman"/>
+          <w:rFonts w:ascii="Calibri" w:eastAsia="Calibri" w:hAnsi="Calibri" w:cs="Times New Roman"/>
           <w:b/>
           <w:bCs/>
           <w:sz w:val="24"/>
@@ -1024,7 +1128,7 @@
       </w:r>
       <w:r>
         <w:rPr>
-          <w:rFonts w:eastAsia="Calibri" w:cs="Times New Roman"/>
+          <w:rFonts w:ascii="Calibri" w:eastAsia="Calibri" w:hAnsi="Calibri" w:cs="Times New Roman"/>
           <w:b/>
           <w:bCs/>
           <w:sz w:val="24"/>
@@ -1034,7 +1138,7 @@
       </w:r>
       <w:r>
         <w:rPr>
-          <w:rFonts w:eastAsia="Calibri" w:cs="Times New Roman"/>
+          <w:rFonts w:ascii="Calibri" w:eastAsia="Calibri" w:hAnsi="Calibri" w:cs="Times New Roman"/>
           <w:b/>
           <w:sz w:val="24"/>
           <w:szCs w:val="24"/>
@@ -1043,7 +1147,7 @@
       </w:r>
       <w:r>
         <w:rPr>
-          <w:rFonts w:eastAsia="Calibri" w:cs="Times New Roman"/>
+          <w:rFonts w:ascii="Calibri" w:eastAsia="Calibri" w:hAnsi="Calibri" w:cs="Times New Roman"/>
           <w:bCs/>
           <w:sz w:val="24"/>
           <w:szCs w:val="24"/>
@@ -1052,7 +1156,7 @@
       </w:r>
       <w:r>
         <w:rPr>
-          <w:rFonts w:eastAsia="Calibri" w:cs="Times New Roman"/>
+          <w:rFonts w:ascii="Calibri" w:eastAsia="Calibri" w:hAnsi="Calibri" w:cs="Times New Roman"/>
           <w:sz w:val="24"/>
           <w:szCs w:val="24"/>
         </w:rPr>
@@ -1061,6 +1165,9 @@
     </w:p>
     <w:p>
       <w:pPr>
+        <w:autoSpaceDE w:val="0"/>
+        <w:autoSpaceDN w:val="0"/>
+        <w:adjustRightInd w:val="0"/>
         <w:spacing w:after="0" w:line="360" w:lineRule="auto"/>
         <w:jc w:val="both"/>
         <w:rPr>
@@ -1071,15 +1178,26 @@
       </w:pPr>
       <w:r>
         <w:rPr>
-          <w:rFonts w:eastAsia="Calibri" w:cs="Times New Roman"/>
-          <w:sz w:val="24"/>
-          <w:szCs w:val="24"/>
-        </w:rPr>
-        <w:t>De contractor begrijpt dat deze overeenkomst op geen enkele manier een contract inhoudt.</w:t>
+          <w:rFonts w:ascii="Calibri" w:eastAsia="Calibri" w:hAnsi="Calibri" w:cs="Times New Roman"/>
+          <w:sz w:val="24"/>
+          <w:szCs w:val="24"/>
+        </w:rPr>
+        <w:t xml:space="preserve">De contractor begrijpt dat deze overeenkomst op geen enkele manier een contract </w:t>
+      </w:r>
+      <w:r>
+        <w:rPr>
+          <w:rFonts w:ascii="Calibri" w:eastAsia="Calibri" w:hAnsi="Calibri" w:cs="Times New Roman"/>
+          <w:sz w:val="24"/>
+          <w:szCs w:val="24"/>
+        </w:rPr>
+        <w:t>inhoudt.</w:t>
       </w:r>
     </w:p>
     <w:p>
       <w:pPr>
+        <w:autoSpaceDE w:val="0"/>
+        <w:autoSpaceDN w:val="0"/>
+        <w:adjustRightInd w:val="0"/>
         <w:spacing w:after="0" w:line="240" w:lineRule="auto"/>
         <w:jc w:val="both"/>
         <w:rPr>
@@ -1092,6 +1210,9 @@
     </w:p>
     <w:p>
       <w:pPr>
+        <w:autoSpaceDE w:val="0"/>
+        <w:autoSpaceDN w:val="0"/>
+        <w:adjustRightInd w:val="0"/>
         <w:spacing w:after="0" w:line="240" w:lineRule="auto"/>
         <w:jc w:val="both"/>
         <w:rPr>
@@ -1103,6 +1224,9 @@
     </w:p>
     <w:p>
       <w:pPr>
+        <w:autoSpaceDE w:val="0"/>
+        <w:autoSpaceDN w:val="0"/>
+        <w:adjustRightInd w:val="0"/>
         <w:spacing w:after="0" w:line="240" w:lineRule="auto"/>
         <w:jc w:val="both"/>
         <w:rPr>
@@ -1117,6 +1241,9 @@
     </w:p>
     <w:p>
       <w:pPr>
+        <w:autoSpaceDE w:val="0"/>
+        <w:autoSpaceDN w:val="0"/>
+        <w:adjustRightInd w:val="0"/>
         <w:spacing w:after="0" w:line="240" w:lineRule="auto"/>
         <w:jc w:val="right"/>
         <w:rPr>
@@ -1131,6 +1258,9 @@
     </w:p>
     <w:p>
       <w:pPr>
+        <w:autoSpaceDE w:val="0"/>
+        <w:autoSpaceDN w:val="0"/>
+        <w:adjustRightInd w:val="0"/>
         <w:spacing w:after="0" w:line="240" w:lineRule="auto"/>
         <w:jc w:val="right"/>
         <w:rPr>
@@ -1141,15 +1271,31 @@
       </w:pPr>
       <w:r>
         <w:rPr>
-          <w:rFonts w:eastAsia="Calibri" w:cs="Times New Roman"/>
-          <w:sz w:val="24"/>
-          <w:szCs w:val="24"/>
-        </w:rPr>
-        <w:t xml:space="preserve">Opgemaakt te  </w:t>
-      </w:r>
-      <w:r>
-        <w:rPr>
-          <w:rFonts w:eastAsia="Calibri" w:cs="Times New Roman"/>
+          <w:rFonts w:ascii="Calibri" w:eastAsia="Calibri" w:hAnsi="Calibri" w:cs="Times New Roman"/>
+          <w:sz w:val="24"/>
+          <w:szCs w:val="24"/>
+        </w:rPr>
+        <w:t>Opgemaakt</w:t>
+      </w:r>
+      <w:r>
+        <w:rPr>
+          <w:rFonts w:ascii="Calibri" w:eastAsia="Calibri" w:hAnsi="Calibri" w:cs="Times New Roman"/>
+          <w:sz w:val="24"/>
+          <w:szCs w:val="24"/>
+        </w:rPr>
+        <w:t xml:space="preserve"> te</w:t>
+      </w:r>
+      <w:r>
+        <w:rPr>
+          <w:rFonts w:ascii="Calibri" w:eastAsia="Calibri" w:hAnsi="Calibri" w:cs="Times New Roman"/>
+          <w:sz w:val="24"/>
+          <w:szCs w:val="24"/>
+        </w:rPr>
+        <w:t xml:space="preserve">  </w:t>
+      </w:r>
+      <w:r>
+        <w:rPr>
+          <w:rFonts w:ascii="Calibri" w:eastAsia="Calibri" w:hAnsi="Calibri" w:cs="Times New Roman"/>
           <w:b/>
           <w:bCs/>
           <w:sz w:val="24"/>
@@ -1159,17 +1305,17 @@
       </w:r>
       <w:r>
         <w:rPr>
-          <w:rFonts w:eastAsia="Calibri" w:cs="Times New Roman"/>
-          <w:b/>
-          <w:bCs/>
-          <w:sz w:val="24"/>
-          <w:szCs w:val="24"/>
-        </w:rPr>
-        <w:instrText xml:space="preserve"> DOCPROPERTY "Leverancier Opgemaakt te"</w:instrText>
-      </w:r>
-      <w:r>
-        <w:rPr>
-          <w:rFonts w:eastAsia="Calibri" w:cs="Times New Roman"/>
+          <w:rFonts w:ascii="Calibri" w:eastAsia="Calibri" w:hAnsi="Calibri" w:cs="Times New Roman"/>
+          <w:b/>
+          <w:bCs/>
+          <w:sz w:val="24"/>
+          <w:szCs w:val="24"/>
+        </w:rPr>
+        <w:instrText xml:space="preserve"> DOCPROPERTY  "Leverancier Opgemaakt te"  \* MERGEFORMAT </w:instrText>
+      </w:r>
+      <w:r>
+        <w:rPr>
+          <w:rFonts w:ascii="Calibri" w:eastAsia="Calibri" w:hAnsi="Calibri" w:cs="Times New Roman"/>
           <w:b/>
           <w:bCs/>
           <w:sz w:val="24"/>
@@ -1179,7 +1325,7 @@
       </w:r>
       <w:r>
         <w:rPr>
-          <w:rFonts w:eastAsia="Calibri" w:cs="Times New Roman"/>
+          <w:rFonts w:ascii="Calibri" w:eastAsia="Calibri" w:hAnsi="Calibri" w:cs="Times New Roman"/>
           <w:b/>
           <w:bCs/>
           <w:sz w:val="24"/>
@@ -1189,7 +1335,7 @@
       </w:r>
       <w:r>
         <w:rPr>
-          <w:rFonts w:eastAsia="Calibri" w:cs="Times New Roman"/>
+          <w:rFonts w:ascii="Calibri" w:eastAsia="Calibri" w:hAnsi="Calibri" w:cs="Times New Roman"/>
           <w:b/>
           <w:bCs/>
           <w:sz w:val="24"/>
@@ -1199,7 +1345,7 @@
       </w:r>
       <w:r>
         <w:rPr>
-          <w:rFonts w:eastAsia="Calibri" w:cs="Times New Roman"/>
+          <w:rFonts w:ascii="Calibri" w:eastAsia="Calibri" w:hAnsi="Calibri" w:cs="Times New Roman"/>
           <w:sz w:val="24"/>
           <w:szCs w:val="24"/>
         </w:rPr>
@@ -1207,24 +1353,58 @@
       </w:r>
       <w:r>
         <w:rPr>
-          <w:rFonts w:eastAsia="Calibri" w:cs="Times New Roman"/>
-          <w:bCs/>
-          <w:sz w:val="24"/>
-          <w:szCs w:val="24"/>
-        </w:rPr>
-        <w:t>[stad/gemeente]</w:t>
-      </w:r>
-      <w:r>
-        <w:rPr>
-          <w:rFonts w:eastAsia="Calibri" w:cs="Times New Roman"/>
-          <w:sz w:val="24"/>
-          <w:szCs w:val="24"/>
-        </w:rPr>
-        <w:t xml:space="preserve"> op  </w:t>
-      </w:r>
-      <w:r>
-        <w:rPr>
-          <w:rFonts w:eastAsia="Calibri" w:cs="Times New Roman"/>
+          <w:rFonts w:ascii="Calibri" w:eastAsia="Calibri" w:hAnsi="Calibri" w:cs="Times New Roman"/>
+          <w:bCs/>
+          <w:sz w:val="24"/>
+          <w:szCs w:val="24"/>
+        </w:rPr>
+        <w:t>[</w:t>
+      </w:r>
+      <w:r>
+        <w:rPr>
+          <w:rFonts w:ascii="Calibri" w:eastAsia="Calibri" w:hAnsi="Calibri" w:cs="Times New Roman"/>
+          <w:bCs/>
+          <w:sz w:val="24"/>
+          <w:szCs w:val="24"/>
+        </w:rPr>
+        <w:t>stad/gemeente</w:t>
+      </w:r>
+      <w:r>
+        <w:rPr>
+          <w:rFonts w:ascii="Calibri" w:eastAsia="Calibri" w:hAnsi="Calibri" w:cs="Times New Roman"/>
+          <w:bCs/>
+          <w:sz w:val="24"/>
+          <w:szCs w:val="24"/>
+        </w:rPr>
+        <w:t>]</w:t>
+      </w:r>
+      <w:r>
+        <w:rPr>
+          <w:rFonts w:ascii="Calibri" w:eastAsia="Calibri" w:hAnsi="Calibri" w:cs="Times New Roman"/>
+          <w:sz w:val="24"/>
+          <w:szCs w:val="24"/>
+        </w:rPr>
+        <w:t xml:space="preserve"> o</w:t>
+      </w:r>
+      <w:r>
+        <w:rPr>
+          <w:rFonts w:ascii="Calibri" w:eastAsia="Calibri" w:hAnsi="Calibri" w:cs="Times New Roman"/>
+          <w:sz w:val="24"/>
+          <w:szCs w:val="24"/>
+        </w:rPr>
+        <w:t>p</w:t>
+      </w:r>
+      <w:r>
+        <w:rPr>
+          <w:rFonts w:ascii="Calibri" w:eastAsia="Calibri" w:hAnsi="Calibri" w:cs="Times New Roman"/>
+          <w:sz w:val="24"/>
+          <w:szCs w:val="24"/>
+        </w:rPr>
+        <w:t xml:space="preserve">  </w:t>
+      </w:r>
+      <w:r>
+        <w:rPr>
+          <w:rFonts w:ascii="Calibri" w:eastAsia="Calibri" w:hAnsi="Calibri" w:cs="Times New Roman"/>
           <w:b/>
           <w:sz w:val="24"/>
           <w:szCs w:val="24"/>
@@ -1233,16 +1413,16 @@
       </w:r>
       <w:r>
         <w:rPr>
-          <w:rFonts w:eastAsia="Calibri" w:cs="Times New Roman"/>
-          <w:b/>
-          <w:sz w:val="24"/>
-          <w:szCs w:val="24"/>
-        </w:rPr>
-        <w:instrText xml:space="preserve"> DATE  \@ "d/MM/yyyy" </w:instrText>
-      </w:r>
-      <w:r>
-        <w:rPr>
-          <w:rFonts w:eastAsia="Calibri" w:cs="Times New Roman"/>
+          <w:rFonts w:ascii="Calibri" w:eastAsia="Calibri" w:hAnsi="Calibri" w:cs="Times New Roman"/>
+          <w:b/>
+          <w:sz w:val="24"/>
+          <w:szCs w:val="24"/>
+        </w:rPr>
+        <w:instrText xml:space="preserve"> DATE   \* MERGEFORMAT </w:instrText>
+      </w:r>
+      <w:r>
+        <w:rPr>
+          <w:rFonts w:ascii="Calibri" w:eastAsia="Calibri" w:hAnsi="Calibri" w:cs="Times New Roman"/>
           <w:b/>
           <w:sz w:val="24"/>
           <w:szCs w:val="24"/>
@@ -1251,17 +1431,17 @@
       </w:r>
       <w:r>
         <w:rPr>
-          <w:rFonts w:eastAsia="Calibri" w:cs="Times New Roman"/>
+          <w:rFonts w:ascii="Calibri" w:eastAsia="Calibri" w:hAnsi="Calibri" w:cs="Times New Roman"/>
           <w:b/>
           <w:noProof/>
           <w:sz w:val="24"/>
           <w:szCs w:val="24"/>
         </w:rPr>
-        <w:t>8/01/2024</w:t>
-      </w:r>
-      <w:r>
-        <w:rPr>
-          <w:rFonts w:eastAsia="Calibri" w:cs="Times New Roman"/>
+        <w:t>20/12/2023</w:t>
+      </w:r>
+      <w:r>
+        <w:rPr>
+          <w:rFonts w:ascii="Calibri" w:eastAsia="Calibri" w:hAnsi="Calibri" w:cs="Times New Roman"/>
           <w:b/>
           <w:sz w:val="24"/>
           <w:szCs w:val="24"/>
@@ -1270,7 +1450,7 @@
       </w:r>
       <w:r>
         <w:rPr>
-          <w:rFonts w:eastAsia="Calibri" w:cs="Times New Roman"/>
+          <w:rFonts w:ascii="Calibri" w:eastAsia="Calibri" w:hAnsi="Calibri" w:cs="Times New Roman"/>
           <w:sz w:val="24"/>
           <w:szCs w:val="24"/>
         </w:rPr>
@@ -1278,16 +1458,37 @@
       </w:r>
       <w:r>
         <w:rPr>
-          <w:rFonts w:eastAsia="Calibri" w:cs="Times New Roman"/>
-          <w:bCs/>
-          <w:sz w:val="24"/>
-          <w:szCs w:val="24"/>
-        </w:rPr>
-        <w:t>[datum]</w:t>
+          <w:rFonts w:ascii="Calibri" w:eastAsia="Calibri" w:hAnsi="Calibri" w:cs="Times New Roman"/>
+          <w:bCs/>
+          <w:sz w:val="24"/>
+          <w:szCs w:val="24"/>
+        </w:rPr>
+        <w:t>[d</w:t>
+      </w:r>
+      <w:r>
+        <w:rPr>
+          <w:rFonts w:ascii="Calibri" w:eastAsia="Calibri" w:hAnsi="Calibri" w:cs="Times New Roman"/>
+          <w:bCs/>
+          <w:sz w:val="24"/>
+          <w:szCs w:val="24"/>
+        </w:rPr>
+        <w:t>atum</w:t>
+      </w:r>
+      <w:r>
+        <w:rPr>
+          <w:rFonts w:ascii="Calibri" w:eastAsia="Calibri" w:hAnsi="Calibri" w:cs="Times New Roman"/>
+          <w:bCs/>
+          <w:sz w:val="24"/>
+          <w:szCs w:val="24"/>
+        </w:rPr>
+        <w:t>]</w:t>
       </w:r>
     </w:p>
     <w:p>
       <w:pPr>
+        <w:autoSpaceDE w:val="0"/>
+        <w:autoSpaceDN w:val="0"/>
+        <w:adjustRightInd w:val="0"/>
         <w:spacing w:after="0" w:line="240" w:lineRule="auto"/>
         <w:jc w:val="both"/>
         <w:rPr>
@@ -1302,6 +1503,9 @@
     </w:p>
     <w:p>
       <w:pPr>
+        <w:autoSpaceDE w:val="0"/>
+        <w:autoSpaceDN w:val="0"/>
+        <w:adjustRightInd w:val="0"/>
         <w:spacing w:after="0" w:line="240" w:lineRule="auto"/>
         <w:jc w:val="both"/>
         <w:rPr>
@@ -1313,6 +1517,9 @@
     </w:p>
     <w:p>
       <w:pPr>
+        <w:autoSpaceDE w:val="0"/>
+        <w:autoSpaceDN w:val="0"/>
+        <w:adjustRightInd w:val="0"/>
         <w:spacing w:after="0" w:line="240" w:lineRule="auto"/>
         <w:jc w:val="both"/>
         <w:rPr>
@@ -1324,6 +1531,9 @@
     </w:p>
     <w:p>
       <w:pPr>
+        <w:autoSpaceDE w:val="0"/>
+        <w:autoSpaceDN w:val="0"/>
+        <w:adjustRightInd w:val="0"/>
         <w:spacing w:after="0" w:line="240" w:lineRule="auto"/>
         <w:jc w:val="both"/>
         <w:rPr>
@@ -1335,6 +1545,9 @@
     </w:p>
     <w:p>
       <w:pPr>
+        <w:autoSpaceDE w:val="0"/>
+        <w:autoSpaceDN w:val="0"/>
+        <w:adjustRightInd w:val="0"/>
         <w:spacing w:after="0" w:line="240" w:lineRule="auto"/>
         <w:jc w:val="both"/>
         <w:rPr>
@@ -1346,6 +1559,9 @@
     </w:p>
     <w:p>
       <w:pPr>
+        <w:autoSpaceDE w:val="0"/>
+        <w:autoSpaceDN w:val="0"/>
+        <w:adjustRightInd w:val="0"/>
         <w:spacing w:after="0" w:line="240" w:lineRule="auto"/>
         <w:jc w:val="both"/>
         <w:rPr>
@@ -1356,143 +1572,441 @@
       </w:pPr>
       <w:r>
         <w:rPr>
+          <w:b/>
+          <w:bCs/>
           <w:noProof/>
         </w:rPr>
-        <w:pict w14:anchorId="2588745E">
-          <v:rect id="Text Box 2" o:spid="_x0000_s1027" style="position:absolute;left:0;text-align:left;margin-left:-9.35pt;margin-top:7.65pt;width:212.25pt;height:99.4pt;z-index:-503316478;visibility:visible;mso-wrap-style:square;mso-width-percent:400;mso-height-percent:200;mso-wrap-distance-left:0;mso-wrap-distance-top:0;mso-wrap-distance-right:0;mso-wrap-distance-bottom:0;mso-position-horizontal:absolute;mso-position-horizontal-relative:text;mso-position-vertical:absolute;mso-position-vertical-relative:text;mso-width-percent:400;mso-height-percent:200;mso-width-relative:margin;mso-height-relative:margin;v-text-anchor:top" o:gfxdata="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" filled="f" stroked="f">
-            <v:textbox style="mso-fit-shape-to-text:t">
-              <w:txbxContent>
-                <w:p>
-                  <w:pPr>
-                    <w:pStyle w:val="FrameContents"/>
-                    <w:rPr>
-                      <w:lang w:val="en-GB"/>
-                    </w:rPr>
-                  </w:pPr>
-                  <w:r>
-                    <w:rPr>
-                      <w:noProof/>
-                      <w:color w:val="000000"/>
-                    </w:rPr>
-                    <w:drawing>
-                      <wp:inline distT="0" distB="0" distL="0" distR="0" wp14:anchorId="3FCE34EB" wp14:editId="64D0EFE3">
-                        <wp:extent cx="2089785" cy="1172210"/>
-                        <wp:effectExtent l="0" t="0" r="0" b="0"/>
-                        <wp:docPr id="3" name="Picture 2" descr="A close up of a device&#10;&#10;Description automatically generated"/>
-                        <wp:cNvGraphicFramePr>
-                          <a:graphicFrameLocks xmlns:a="http://schemas.openxmlformats.org/drawingml/2006/main" noChangeAspect="1"/>
-                        </wp:cNvGraphicFramePr>
-                        <a:graphic xmlns:a="http://schemas.openxmlformats.org/drawingml/2006/main">
-                          <a:graphicData uri="http://schemas.openxmlformats.org/drawingml/2006/picture">
-                            <pic:pic xmlns:pic="http://schemas.openxmlformats.org/drawingml/2006/picture">
-                              <pic:nvPicPr>
-                                <pic:cNvPr id="3" name="Picture 2" descr="A close up of a device&#10;&#10;Description automatically generated"/>
-                                <pic:cNvPicPr>
-                                  <a:picLocks noChangeAspect="1" noChangeArrowheads="1"/>
-                                </pic:cNvPicPr>
-                              </pic:nvPicPr>
-                              <pic:blipFill>
-                                <a:blip r:embed="rId7"/>
-                                <a:stretch>
-                                  <a:fillRect/>
-                                </a:stretch>
-                              </pic:blipFill>
-                              <pic:spPr bwMode="auto">
-                                <a:xfrm>
-                                  <a:off x="0" y="0"/>
-                                  <a:ext cx="2089785" cy="1172210"/>
-                                </a:xfrm>
-                                <a:prstGeom prst="rect">
-                                  <a:avLst/>
-                                </a:prstGeom>
-                              </pic:spPr>
-                            </pic:pic>
-                          </a:graphicData>
-                        </a:graphic>
-                      </wp:inline>
-                    </w:drawing>
-                  </w:r>
-                </w:p>
-              </w:txbxContent>
-            </v:textbox>
-          </v:rect>
-        </w:pict>
-      </w:r>
-      <w:r>
-        <w:rPr>
+        <mc:AlternateContent>
+          <mc:Choice Requires="wps">
+            <w:drawing>
+              <wp:anchor distT="45720" distB="45720" distL="114300" distR="114300" simplePos="0" relativeHeight="251659264" behindDoc="1" locked="0" layoutInCell="1" allowOverlap="1" wp14:anchorId="3AA95489" wp14:editId="1D9A2E62">
+                <wp:simplePos x="0" y="0"/>
+                <wp:positionH relativeFrom="column">
+                  <wp:posOffset>3381375</wp:posOffset>
+                </wp:positionH>
+                <wp:positionV relativeFrom="paragraph">
+                  <wp:posOffset>254635</wp:posOffset>
+                </wp:positionV>
+                <wp:extent cx="2360930" cy="1404620"/>
+                <wp:effectExtent l="0" t="0" r="0" b="0"/>
+                <wp:wrapNone/>
+                <wp:docPr id="3" name="Text Box 2"/>
+                <wp:cNvGraphicFramePr>
+                  <a:graphicFrameLocks xmlns:a="http://schemas.openxmlformats.org/drawingml/2006/main"/>
+                </wp:cNvGraphicFramePr>
+                <a:graphic xmlns:a="http://schemas.openxmlformats.org/drawingml/2006/main">
+                  <a:graphicData uri="http://schemas.microsoft.com/office/word/2010/wordprocessingShape">
+                    <wps:wsp>
+                      <wps:cNvSpPr txBox="1">
+                        <a:spLocks noChangeArrowheads="1"/>
+                      </wps:cNvSpPr>
+                      <wps:spPr bwMode="auto">
+                        <a:xfrm>
+                          <a:off x="0" y="0"/>
+                          <a:ext cx="2360930" cy="1404620"/>
+                        </a:xfrm>
+                        <a:prstGeom prst="rect">
+                          <a:avLst/>
+                        </a:prstGeom>
+                        <a:noFill/>
+                        <a:ln w="9525">
+                          <a:noFill/>
+                          <a:miter lim="800000"/>
+                          <a:headEnd/>
+                          <a:tailEnd/>
+                        </a:ln>
+                      </wps:spPr>
+                      <wps:txbx>
+                        <w:txbxContent>
+                          <w:p>
+                            <w:pPr>
+                              <w:rPr>
+                                <w:lang w:val="en-GB"/>
+                              </w:rPr>
+                            </w:pPr>
+                            <w:r>
+                              <w:rPr>
+                                <w:rFonts w:ascii="Calibri" w:eastAsia="Calibri" w:hAnsi="Calibri" w:cs="Times New Roman"/>
+                                <w:b/>
+                                <w:noProof/>
+                                <w:sz w:val="24"/>
+                                <w:szCs w:val="24"/>
+                              </w:rPr>
+                              <w:drawing>
+                                <wp:inline distT="0" distB="0" distL="0" distR="0" wp14:anchorId="508DD847" wp14:editId="44AC7A97">
+                                  <wp:extent cx="2170118" cy="1266523"/>
+                                  <wp:effectExtent l="0" t="0" r="1905" b="0"/>
+                                  <wp:docPr id="4" name="Picture 4" descr="A close up of a device&#10;&#10;Description automatically generated"/>
+                                  <wp:cNvGraphicFramePr>
+                                    <a:graphicFrameLocks xmlns:a="http://schemas.openxmlformats.org/drawingml/2006/main" noChangeAspect="1"/>
+                                  </wp:cNvGraphicFramePr>
+                                  <a:graphic xmlns:a="http://schemas.openxmlformats.org/drawingml/2006/main">
+                                    <a:graphicData uri="http://schemas.openxmlformats.org/drawingml/2006/picture">
+                                      <pic:pic xmlns:pic="http://schemas.openxmlformats.org/drawingml/2006/picture">
+                                        <pic:nvPicPr>
+                                          <pic:cNvPr id="1" name="JohanSign.jpg"/>
+                                          <pic:cNvPicPr/>
+                                        </pic:nvPicPr>
+                                        <pic:blipFill>
+                                          <a:blip r:embed="rId7">
+                                            <a:extLst>
+                                              <a:ext uri="{28A0092B-C50C-407E-A947-70E740481C1C}">
+                                                <a14:useLocalDpi xmlns:a14="http://schemas.microsoft.com/office/drawing/2010/main" val="0"/>
+                                              </a:ext>
+                                            </a:extLst>
+                                          </a:blip>
+                                          <a:stretch>
+                                            <a:fillRect/>
+                                          </a:stretch>
+                                        </pic:blipFill>
+                                        <pic:spPr>
+                                          <a:xfrm>
+                                            <a:off x="0" y="0"/>
+                                            <a:ext cx="2178124" cy="1271195"/>
+                                          </a:xfrm>
+                                          <a:prstGeom prst="rect">
+                                            <a:avLst/>
+                                          </a:prstGeom>
+                                        </pic:spPr>
+                                      </pic:pic>
+                                    </a:graphicData>
+                                  </a:graphic>
+                                </wp:inline>
+                              </w:drawing>
+                            </w:r>
+                          </w:p>
+                        </w:txbxContent>
+                      </wps:txbx>
+                      <wps:bodyPr rot="0" vert="horz" wrap="square" lIns="91440" tIns="45720" rIns="91440" bIns="45720" anchor="t" anchorCtr="0">
+                        <a:spAutoFit/>
+                      </wps:bodyPr>
+                    </wps:wsp>
+                  </a:graphicData>
+                </a:graphic>
+                <wp14:sizeRelH relativeFrom="margin">
+                  <wp14:pctWidth>40000</wp14:pctWidth>
+                </wp14:sizeRelH>
+                <wp14:sizeRelV relativeFrom="margin">
+                  <wp14:pctHeight>20000</wp14:pctHeight>
+                </wp14:sizeRelV>
+              </wp:anchor>
+            </w:drawing>
+          </mc:Choice>
+          <mc:Fallback>
+            <w:pict>
+              <v:shapetype w14:anchorId="3AA95489" id="_x0000_t202" coordsize="21600,21600" o:spt="202" path="m,l,21600r21600,l21600,xe">
+                <v:stroke joinstyle="miter"/>
+                <v:path gradientshapeok="t" o:connecttype="rect"/>
+              </v:shapetype>
+              <v:shape id="Text Box 2" o:spid="_x0000_s1026" type="#_x0000_t202" style="position:absolute;left:0;text-align:left;margin-left:266.25pt;margin-top:20.05pt;width:185.9pt;height:110.6pt;z-index:-251657216;visibility:visible;mso-wrap-style:square;mso-width-percent:400;mso-height-percent:200;mso-wrap-distance-left:9pt;mso-wrap-distance-top:3.6pt;mso-wrap-distance-right:9pt;mso-wrap-distance-bottom:3.6pt;mso-position-horizontal:absolute;mso-position-horizontal-relative:text;mso-position-vertical:absolute;mso-position-vertical-relative:text;mso-width-percent:400;mso-height-percent:200;mso-width-relative:margin;mso-height-relative:margin;v-text-anchor:top" o:gfxdata="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" filled="f" stroked="f">
+                <v:textbox style="mso-fit-shape-to-text:t">
+                  <w:txbxContent>
+                    <w:p>
+                      <w:pPr>
+                        <w:rPr>
+                          <w:lang w:val="en-GB"/>
+                        </w:rPr>
+                      </w:pPr>
+                      <w:r>
+                        <w:rPr>
+                          <w:rFonts w:ascii="Calibri" w:eastAsia="Calibri" w:hAnsi="Calibri" w:cs="Times New Roman"/>
+                          <w:b/>
+                          <w:noProof/>
+                          <w:sz w:val="24"/>
+                          <w:szCs w:val="24"/>
+                        </w:rPr>
+                        <w:drawing>
+                          <wp:inline distT="0" distB="0" distL="0" distR="0" wp14:anchorId="508DD847" wp14:editId="44AC7A97">
+                            <wp:extent cx="2170118" cy="1266523"/>
+                            <wp:effectExtent l="0" t="0" r="1905" b="0"/>
+                            <wp:docPr id="4" name="Picture 4" descr="A close up of a device&#10;&#10;Description automatically generated"/>
+                            <wp:cNvGraphicFramePr>
+                              <a:graphicFrameLocks xmlns:a="http://schemas.openxmlformats.org/drawingml/2006/main" noChangeAspect="1"/>
+                            </wp:cNvGraphicFramePr>
+                            <a:graphic xmlns:a="http://schemas.openxmlformats.org/drawingml/2006/main">
+                              <a:graphicData uri="http://schemas.openxmlformats.org/drawingml/2006/picture">
+                                <pic:pic xmlns:pic="http://schemas.openxmlformats.org/drawingml/2006/picture">
+                                  <pic:nvPicPr>
+                                    <pic:cNvPr id="1" name="JohanSign.jpg"/>
+                                    <pic:cNvPicPr/>
+                                  </pic:nvPicPr>
+                                  <pic:blipFill>
+                                    <a:blip r:embed="rId7">
+                                      <a:extLst>
+                                        <a:ext uri="{28A0092B-C50C-407E-A947-70E740481C1C}">
+                                          <a14:useLocalDpi xmlns:a14="http://schemas.microsoft.com/office/drawing/2010/main" val="0"/>
+                                        </a:ext>
+                                      </a:extLst>
+                                    </a:blip>
+                                    <a:stretch>
+                                      <a:fillRect/>
+                                    </a:stretch>
+                                  </pic:blipFill>
+                                  <pic:spPr>
+                                    <a:xfrm>
+                                      <a:off x="0" y="0"/>
+                                      <a:ext cx="2178124" cy="1271195"/>
+                                    </a:xfrm>
+                                    <a:prstGeom prst="rect">
+                                      <a:avLst/>
+                                    </a:prstGeom>
+                                  </pic:spPr>
+                                </pic:pic>
+                              </a:graphicData>
+                            </a:graphic>
+                          </wp:inline>
+                        </w:drawing>
+                      </w:r>
+                    </w:p>
+                  </w:txbxContent>
+                </v:textbox>
+              </v:shape>
+            </w:pict>
+          </mc:Fallback>
+        </mc:AlternateContent>
+      </w:r>
+      <w:r>
+        <w:rPr>
+          <w:b/>
+          <w:bCs/>
           <w:noProof/>
         </w:rPr>
-        <w:pict w14:anchorId="6AFDD494">
-          <v:rect id="_x0000_s1026" style="position:absolute;left:0;text-align:left;margin-left:266.25pt;margin-top:20.05pt;width:212.25pt;height:106.8pt;z-index:-503316476;visibility:visible;mso-wrap-style:square;mso-width-percent:400;mso-height-percent:200;mso-wrap-distance-left:0;mso-wrap-distance-top:0;mso-wrap-distance-right:0;mso-wrap-distance-bottom:0;mso-position-horizontal:absolute;mso-position-horizontal-relative:text;mso-position-vertical:absolute;mso-position-vertical-relative:text;mso-width-percent:400;mso-height-percent:200;mso-width-relative:margin;mso-height-relative:margin;v-text-anchor:top" o:gfxdata="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" filled="f" stroked="f">
-            <v:textbox style="mso-fit-shape-to-text:t">
-              <w:txbxContent>
-                <w:p>
-                  <w:pPr>
-                    <w:pStyle w:val="FrameContents"/>
-                    <w:rPr>
-                      <w:lang w:val="en-GB"/>
-                    </w:rPr>
-                  </w:pPr>
-                  <w:r>
-                    <w:rPr>
-                      <w:noProof/>
-                      <w:color w:val="000000"/>
-                    </w:rPr>
-                    <w:drawing>
-                      <wp:inline distT="0" distB="0" distL="0" distR="0" wp14:anchorId="3E8FD379" wp14:editId="2EB09409">
-                        <wp:extent cx="2169795" cy="1266190"/>
-                        <wp:effectExtent l="0" t="0" r="0" b="0"/>
-                        <wp:docPr id="4" name="Picture 4" descr="A close up of a device&#10;&#10;Description automatically generated"/>
-                        <wp:cNvGraphicFramePr>
-                          <a:graphicFrameLocks xmlns:a="http://schemas.openxmlformats.org/drawingml/2006/main" noChangeAspect="1"/>
-                        </wp:cNvGraphicFramePr>
-                        <a:graphic xmlns:a="http://schemas.openxmlformats.org/drawingml/2006/main">
-                          <a:graphicData uri="http://schemas.openxmlformats.org/drawingml/2006/picture">
-                            <pic:pic xmlns:pic="http://schemas.openxmlformats.org/drawingml/2006/picture">
-                              <pic:nvPicPr>
-                                <pic:cNvPr id="4" name="Picture 4" descr="A close up of a device&#10;&#10;Description automatically generated"/>
-                                <pic:cNvPicPr>
-                                  <a:picLocks noChangeAspect="1" noChangeArrowheads="1"/>
-                                </pic:cNvPicPr>
-                              </pic:nvPicPr>
-                              <pic:blipFill>
-                                <a:blip r:embed="rId7"/>
-                                <a:stretch>
-                                  <a:fillRect/>
-                                </a:stretch>
-                              </pic:blipFill>
-                              <pic:spPr bwMode="auto">
-                                <a:xfrm>
-                                  <a:off x="0" y="0"/>
-                                  <a:ext cx="2169795" cy="1266190"/>
-                                </a:xfrm>
-                                <a:prstGeom prst="rect">
-                                  <a:avLst/>
-                                </a:prstGeom>
-                              </pic:spPr>
-                            </pic:pic>
-                          </a:graphicData>
-                        </a:graphic>
-                      </wp:inline>
-                    </w:drawing>
-                  </w:r>
-                </w:p>
-              </w:txbxContent>
-            </v:textbox>
-          </v:rect>
-        </w:pict>
-      </w:r>
-      <w:r>
-        <w:rPr>
-          <w:rFonts w:eastAsia="Calibri" w:cs="Times New Roman"/>
-          <w:sz w:val="24"/>
-          <w:szCs w:val="24"/>
-        </w:rPr>
-        <w:t xml:space="preserve">____________________________                                   _____________________________         Naam en handtekening kandidaat </w:t>
-      </w:r>
-      <w:r>
-        <w:rPr>
-          <w:rFonts w:eastAsia="Calibri" w:cs="Times New Roman"/>
+        <mc:AlternateContent>
+          <mc:Choice Requires="wps">
+            <w:drawing>
+              <wp:anchor distT="45720" distB="45720" distL="114300" distR="114300" simplePos="0" relativeHeight="251657216" behindDoc="1" locked="0" layoutInCell="1" allowOverlap="1" wp14:anchorId="2CCB049C" wp14:editId="5F53B73D">
+                <wp:simplePos x="0" y="0"/>
+                <wp:positionH relativeFrom="column">
+                  <wp:posOffset>-118745</wp:posOffset>
+                </wp:positionH>
+                <wp:positionV relativeFrom="paragraph">
+                  <wp:posOffset>97155</wp:posOffset>
+                </wp:positionV>
+                <wp:extent cx="2360930" cy="1404620"/>
+                <wp:effectExtent l="0" t="0" r="0" b="0"/>
+                <wp:wrapNone/>
+                <wp:docPr id="217" name="Text Box 2"/>
+                <wp:cNvGraphicFramePr>
+                  <a:graphicFrameLocks xmlns:a="http://schemas.openxmlformats.org/drawingml/2006/main"/>
+                </wp:cNvGraphicFramePr>
+                <a:graphic xmlns:a="http://schemas.openxmlformats.org/drawingml/2006/main">
+                  <a:graphicData uri="http://schemas.microsoft.com/office/word/2010/wordprocessingShape">
+                    <wps:wsp>
+                      <wps:cNvSpPr txBox="1">
+                        <a:spLocks noChangeArrowheads="1"/>
+                      </wps:cNvSpPr>
+                      <wps:spPr bwMode="auto">
+                        <a:xfrm>
+                          <a:off x="0" y="0"/>
+                          <a:ext cx="2360930" cy="1404620"/>
+                        </a:xfrm>
+                        <a:prstGeom prst="rect">
+                          <a:avLst/>
+                        </a:prstGeom>
+                        <a:noFill/>
+                        <a:ln w="9525">
+                          <a:noFill/>
+                          <a:miter lim="800000"/>
+                          <a:headEnd/>
+                          <a:tailEnd/>
+                        </a:ln>
+                      </wps:spPr>
+                      <wps:txbx>
+                        <w:txbxContent>
+                          <w:p>
+                            <w:pPr>
+                              <w:rPr>
+                                <w:lang w:val="en-GB"/>
+                              </w:rPr>
+                            </w:pPr>
+                            <w:r>
+                              <w:rPr>
+                                <w:rFonts w:ascii="Calibri" w:eastAsia="Calibri" w:hAnsi="Calibri" w:cs="Times New Roman"/>
+                                <w:b/>
+                                <w:noProof/>
+                                <w:sz w:val="24"/>
+                                <w:szCs w:val="24"/>
+                              </w:rPr>
+                              <w:drawing>
+                                <wp:inline distT="0" distB="0" distL="0" distR="0" wp14:anchorId="09A3492C" wp14:editId="26F65A41">
+                                  <wp:extent cx="2089785" cy="1171996"/>
+                                  <wp:effectExtent l="0" t="0" r="5715" b="9525"/>
+                                  <wp:docPr id="2" name="Picture 2" descr="A close up of a device&#10;&#10;Description automatically generated"/>
+                                  <wp:cNvGraphicFramePr>
+                                    <a:graphicFrameLocks xmlns:a="http://schemas.openxmlformats.org/drawingml/2006/main" noChangeAspect="1"/>
+                                  </wp:cNvGraphicFramePr>
+                                  <a:graphic xmlns:a="http://schemas.openxmlformats.org/drawingml/2006/main">
+                                    <a:graphicData uri="http://schemas.openxmlformats.org/drawingml/2006/picture">
+                                      <pic:pic xmlns:pic="http://schemas.openxmlformats.org/drawingml/2006/picture">
+                                        <pic:nvPicPr>
+                                          <pic:cNvPr id="1" name="JohanSign.jpg"/>
+                                          <pic:cNvPicPr/>
+                                        </pic:nvPicPr>
+                                        <pic:blipFill>
+                                          <a:blip r:embed="rId7">
+                                            <a:extLst>
+                                              <a:ext uri="{28A0092B-C50C-407E-A947-70E740481C1C}">
+                                                <a14:useLocalDpi xmlns:a14="http://schemas.microsoft.com/office/drawing/2010/main" val="0"/>
+                                              </a:ext>
+                                            </a:extLst>
+                                          </a:blip>
+                                          <a:stretch>
+                                            <a:fillRect/>
+                                          </a:stretch>
+                                        </pic:blipFill>
+                                        <pic:spPr>
+                                          <a:xfrm>
+                                            <a:off x="0" y="0"/>
+                                            <a:ext cx="2089785" cy="1171996"/>
+                                          </a:xfrm>
+                                          <a:prstGeom prst="rect">
+                                            <a:avLst/>
+                                          </a:prstGeom>
+                                        </pic:spPr>
+                                      </pic:pic>
+                                    </a:graphicData>
+                                  </a:graphic>
+                                </wp:inline>
+                              </w:drawing>
+                            </w:r>
+                          </w:p>
+                        </w:txbxContent>
+                      </wps:txbx>
+                      <wps:bodyPr rot="0" vert="horz" wrap="square" lIns="91440" tIns="45720" rIns="91440" bIns="45720" anchor="t" anchorCtr="0">
+                        <a:spAutoFit/>
+                      </wps:bodyPr>
+                    </wps:wsp>
+                  </a:graphicData>
+                </a:graphic>
+                <wp14:sizeRelH relativeFrom="margin">
+                  <wp14:pctWidth>40000</wp14:pctWidth>
+                </wp14:sizeRelH>
+                <wp14:sizeRelV relativeFrom="margin">
+                  <wp14:pctHeight>20000</wp14:pctHeight>
+                </wp14:sizeRelV>
+              </wp:anchor>
+            </w:drawing>
+          </mc:Choice>
+          <mc:Fallback>
+            <w:pict>
+              <v:shape w14:anchorId="2CCB049C" id="_x0000_s1027" type="#_x0000_t202" style="position:absolute;left:0;text-align:left;margin-left:-9.35pt;margin-top:7.65pt;width:185.9pt;height:110.6pt;z-index:-251659264;visibility:visible;mso-wrap-style:square;mso-width-percent:400;mso-height-percent:200;mso-wrap-distance-left:9pt;mso-wrap-distance-top:3.6pt;mso-wrap-distance-right:9pt;mso-wrap-distance-bottom:3.6pt;mso-position-horizontal:absolute;mso-position-horizontal-relative:text;mso-position-vertical:absolute;mso-position-vertical-relative:text;mso-width-percent:400;mso-height-percent:200;mso-width-relative:margin;mso-height-relative:margin;v-text-anchor:top" o:gfxdata="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" filled="f" stroked="f">
+                <v:textbox style="mso-fit-shape-to-text:t">
+                  <w:txbxContent>
+                    <w:p>
+                      <w:pPr>
+                        <w:rPr>
+                          <w:lang w:val="en-GB"/>
+                        </w:rPr>
+                      </w:pPr>
+                      <w:r>
+                        <w:rPr>
+                          <w:rFonts w:ascii="Calibri" w:eastAsia="Calibri" w:hAnsi="Calibri" w:cs="Times New Roman"/>
+                          <w:b/>
+                          <w:noProof/>
+                          <w:sz w:val="24"/>
+                          <w:szCs w:val="24"/>
+                        </w:rPr>
+                        <w:drawing>
+                          <wp:inline distT="0" distB="0" distL="0" distR="0" wp14:anchorId="09A3492C" wp14:editId="26F65A41">
+                            <wp:extent cx="2089785" cy="1171996"/>
+                            <wp:effectExtent l="0" t="0" r="5715" b="9525"/>
+                            <wp:docPr id="2" name="Picture 2" descr="A close up of a device&#10;&#10;Description automatically generated"/>
+                            <wp:cNvGraphicFramePr>
+                              <a:graphicFrameLocks xmlns:a="http://schemas.openxmlformats.org/drawingml/2006/main" noChangeAspect="1"/>
+                            </wp:cNvGraphicFramePr>
+                            <a:graphic xmlns:a="http://schemas.openxmlformats.org/drawingml/2006/main">
+                              <a:graphicData uri="http://schemas.openxmlformats.org/drawingml/2006/picture">
+                                <pic:pic xmlns:pic="http://schemas.openxmlformats.org/drawingml/2006/picture">
+                                  <pic:nvPicPr>
+                                    <pic:cNvPr id="1" name="JohanSign.jpg"/>
+                                    <pic:cNvPicPr/>
+                                  </pic:nvPicPr>
+                                  <pic:blipFill>
+                                    <a:blip r:embed="rId7">
+                                      <a:extLst>
+                                        <a:ext uri="{28A0092B-C50C-407E-A947-70E740481C1C}">
+                                          <a14:useLocalDpi xmlns:a14="http://schemas.microsoft.com/office/drawing/2010/main" val="0"/>
+                                        </a:ext>
+                                      </a:extLst>
+                                    </a:blip>
+                                    <a:stretch>
+                                      <a:fillRect/>
+                                    </a:stretch>
+                                  </pic:blipFill>
+                                  <pic:spPr>
+                                    <a:xfrm>
+                                      <a:off x="0" y="0"/>
+                                      <a:ext cx="2089785" cy="1171996"/>
+                                    </a:xfrm>
+                                    <a:prstGeom prst="rect">
+                                      <a:avLst/>
+                                    </a:prstGeom>
+                                  </pic:spPr>
+                                </pic:pic>
+                              </a:graphicData>
+                            </a:graphic>
+                          </wp:inline>
+                        </w:drawing>
+                      </w:r>
+                    </w:p>
+                  </w:txbxContent>
+                </v:textbox>
+              </v:shape>
+            </w:pict>
+          </mc:Fallback>
+        </mc:AlternateContent>
+      </w:r>
+      <w:r>
+        <w:rPr>
+          <w:rFonts w:ascii="Calibri" w:eastAsia="Calibri" w:hAnsi="Calibri" w:cs="Times New Roman"/>
+          <w:sz w:val="24"/>
+          <w:szCs w:val="24"/>
+        </w:rPr>
+        <w:t>_________</w:t>
+      </w:r>
+      <w:r>
+        <w:rPr>
+          <w:rFonts w:ascii="Calibri" w:eastAsia="Calibri" w:hAnsi="Calibri" w:cs="Times New Roman"/>
+          <w:sz w:val="24"/>
+          <w:szCs w:val="24"/>
+        </w:rPr>
+        <w:t>___________________</w:t>
+      </w:r>
+      <w:r>
+        <w:rPr>
+          <w:rFonts w:ascii="Calibri" w:eastAsia="Calibri" w:hAnsi="Calibri" w:cs="Times New Roman"/>
+          <w:sz w:val="24"/>
+          <w:szCs w:val="24"/>
+        </w:rPr>
+        <w:t xml:space="preserve">                                   _____</w:t>
+      </w:r>
+      <w:r>
+        <w:rPr>
+          <w:rFonts w:ascii="Calibri" w:eastAsia="Calibri" w:hAnsi="Calibri" w:cs="Times New Roman"/>
+          <w:sz w:val="24"/>
+          <w:szCs w:val="24"/>
+        </w:rPr>
+        <w:t xml:space="preserve">________________________         </w:t>
+      </w:r>
+      <w:r>
+        <w:rPr>
+          <w:rFonts w:ascii="Calibri" w:eastAsia="Calibri" w:hAnsi="Calibri" w:cs="Times New Roman"/>
+          <w:sz w:val="24"/>
+          <w:szCs w:val="24"/>
+        </w:rPr>
+        <w:t>Naam en handtekening kandidaat</w:t>
+      </w:r>
+      <w:r>
+        <w:rPr>
+          <w:rFonts w:ascii="Calibri" w:eastAsia="Calibri" w:hAnsi="Calibri" w:cs="Times New Roman"/>
+          <w:sz w:val="24"/>
+          <w:szCs w:val="24"/>
+        </w:rPr>
+        <w:t xml:space="preserve"> </w:t>
+      </w:r>
+      <w:r>
+        <w:rPr>
+          <w:rFonts w:ascii="Calibri" w:eastAsia="Calibri" w:hAnsi="Calibri" w:cs="Times New Roman"/>
           <w:sz w:val="24"/>
           <w:szCs w:val="24"/>
         </w:rPr>
@@ -1500,7 +2014,7 @@
       </w:r>
       <w:r>
         <w:rPr>
-          <w:rFonts w:eastAsia="Calibri" w:cs="Times New Roman"/>
+          <w:rFonts w:ascii="Calibri" w:eastAsia="Calibri" w:hAnsi="Calibri" w:cs="Times New Roman"/>
           <w:sz w:val="24"/>
           <w:szCs w:val="24"/>
         </w:rPr>
@@ -1509,12 +2023,20 @@
       </w:r>
       <w:r>
         <w:rPr>
-          <w:rFonts w:eastAsia="Calibri" w:cs="Times New Roman"/>
+          <w:rFonts w:ascii="Calibri" w:eastAsia="Calibri" w:hAnsi="Calibri" w:cs="Times New Roman"/>
           <w:sz w:val="24"/>
           <w:szCs w:val="24"/>
         </w:rPr>
         <w:tab/>
-        <w:t xml:space="preserve">           Naam en handtekening leverancier</w:t>
+        <w:t xml:space="preserve">           </w:t>
+      </w:r>
+      <w:r>
+        <w:rPr>
+          <w:rFonts w:ascii="Calibri" w:eastAsia="Calibri" w:hAnsi="Calibri" w:cs="Times New Roman"/>
+          <w:sz w:val="24"/>
+          <w:szCs w:val="24"/>
+        </w:rPr>
+        <w:t>Naam en handtekening leverancier</w:t>
       </w:r>
     </w:p>
     <w:p>
@@ -1527,7 +2049,7 @@
       </w:pPr>
       <w:r>
         <w:rPr>
-          <w:rFonts w:eastAsia="Calibri" w:cs="Times New Roman"/>
+          <w:rFonts w:ascii="Calibri" w:eastAsia="Calibri" w:hAnsi="Calibri" w:cs="Times New Roman"/>
           <w:b/>
           <w:bCs/>
           <w:sz w:val="24"/>
@@ -1537,17 +2059,18 @@
       </w:r>
       <w:r>
         <w:rPr>
-          <w:rFonts w:eastAsia="Calibri" w:cs="Times New Roman"/>
-          <w:b/>
-          <w:bCs/>
-          <w:sz w:val="24"/>
-          <w:szCs w:val="24"/>
-        </w:rPr>
-        <w:instrText xml:space="preserve"> DOCPROPERTY "Leverancier Kandidaat"</w:instrText>
-      </w:r>
-      <w:r>
-        <w:rPr>
-          <w:rFonts w:eastAsia="Calibri" w:cs="Times New Roman"/>
+          <w:rFonts w:ascii="Calibri" w:eastAsia="Calibri" w:hAnsi="Calibri" w:cs="Times New Roman"/>
+          <w:b/>
+          <w:bCs/>
+          <w:sz w:val="24"/>
+          <w:szCs w:val="24"/>
+          <w:lang w:val="en-GB"/>
+        </w:rPr>
+        <w:instrText xml:space="preserve"> DOCPROPERTY  "Leverancier Kandidaat"  \* MERGEFORMAT </w:instrText>
+      </w:r>
+      <w:r>
+        <w:rPr>
+          <w:rFonts w:ascii="Calibri" w:eastAsia="Calibri" w:hAnsi="Calibri" w:cs="Times New Roman"/>
           <w:b/>
           <w:bCs/>
           <w:sz w:val="24"/>
@@ -1557,17 +2080,18 @@
       </w:r>
       <w:r>
         <w:rPr>
-          <w:rFonts w:eastAsia="Calibri" w:cs="Times New Roman"/>
-          <w:b/>
-          <w:bCs/>
-          <w:sz w:val="24"/>
-          <w:szCs w:val="24"/>
+          <w:rFonts w:ascii="Calibri" w:eastAsia="Calibri" w:hAnsi="Calibri" w:cs="Times New Roman"/>
+          <w:b/>
+          <w:bCs/>
+          <w:sz w:val="24"/>
+          <w:szCs w:val="24"/>
+          <w:lang w:val="en-GB"/>
         </w:rPr>
         <w:t>******</w:t>
       </w:r>
       <w:r>
         <w:rPr>
-          <w:rFonts w:eastAsia="Calibri" w:cs="Times New Roman"/>
+          <w:rFonts w:ascii="Calibri" w:eastAsia="Calibri" w:hAnsi="Calibri" w:cs="Times New Roman"/>
           <w:b/>
           <w:bCs/>
           <w:sz w:val="24"/>
@@ -1634,7 +2158,7 @@
       </w:r>
       <w:r>
         <w:rPr>
-          <w:rFonts w:eastAsia="Calibri" w:cs="Times New Roman"/>
+          <w:rFonts w:ascii="Calibri" w:eastAsia="Calibri" w:hAnsi="Calibri" w:cs="Times New Roman"/>
           <w:b/>
           <w:bCs/>
           <w:sz w:val="24"/>
@@ -1645,18 +2169,18 @@
       </w:r>
       <w:r>
         <w:rPr>
-          <w:rFonts w:eastAsia="Calibri" w:cs="Times New Roman"/>
+          <w:rFonts w:ascii="Calibri" w:eastAsia="Calibri" w:hAnsi="Calibri" w:cs="Times New Roman"/>
           <w:b/>
           <w:bCs/>
           <w:sz w:val="24"/>
           <w:szCs w:val="24"/>
           <w:lang w:val="en-GB"/>
         </w:rPr>
-        <w:instrText xml:space="preserve"> DOCPROPERTY "Leverancier Naam"</w:instrText>
-      </w:r>
-      <w:r>
-        <w:rPr>
-          <w:rFonts w:eastAsia="Calibri" w:cs="Times New Roman"/>
+        <w:instrText xml:space="preserve"> DOCPROPERTY  "Leverancier Naam"  \* MERGEFORMAT </w:instrText>
+      </w:r>
+      <w:r>
+        <w:rPr>
+          <w:rFonts w:ascii="Calibri" w:eastAsia="Calibri" w:hAnsi="Calibri" w:cs="Times New Roman"/>
           <w:b/>
           <w:bCs/>
           <w:sz w:val="24"/>
@@ -1667,7 +2191,7 @@
       </w:r>
       <w:r>
         <w:rPr>
-          <w:rFonts w:eastAsia="Calibri" w:cs="Times New Roman"/>
+          <w:rFonts w:ascii="Calibri" w:eastAsia="Calibri" w:hAnsi="Calibri" w:cs="Times New Roman"/>
           <w:b/>
           <w:bCs/>
           <w:sz w:val="24"/>
@@ -1678,7 +2202,7 @@
       </w:r>
       <w:r>
         <w:rPr>
-          <w:rFonts w:eastAsia="Calibri" w:cs="Times New Roman"/>
+          <w:rFonts w:ascii="Calibri" w:eastAsia="Calibri" w:hAnsi="Calibri" w:cs="Times New Roman"/>
           <w:b/>
           <w:bCs/>
           <w:sz w:val="24"/>
@@ -1699,10 +2223,9 @@
     </w:p>
     <w:sectPr>
       <w:pgSz w:w="11906" w:h="16838"/>
-      <w:pgMar w:top="1417" w:right="1417" w:bottom="1417" w:left="1417" w:header="0" w:footer="0" w:gutter="0"/>
+      <w:pgMar w:top="1417" w:right="1417" w:bottom="1417" w:left="1417" w:header="708" w:footer="708" w:gutter="0"/>
       <w:cols w:space="708"/>
-      <w:formProt w:val="0"/>
-      <w:docGrid w:linePitch="360" w:charSpace="4096"/>
+      <w:docGrid w:linePitch="360"/>
     </w:sectPr>
   </w:body>
 </w:document>
@@ -1721,7 +2244,7 @@
     </w:rPrDefault>
     <w:pPrDefault>
       <w:pPr>
-        <w:suppressAutoHyphens/>
+        <w:spacing w:after="200" w:line="276" w:lineRule="auto"/>
       </w:pPr>
     </w:pPrDefault>
   </w:docDefaults>
@@ -2106,9 +2629,6 @@
   <w:style w:type="paragraph" w:default="1" w:styleId="Normal">
     <w:name w:val="Normal"/>
     <w:qFormat/>
-    <w:pPr>
-      <w:spacing w:after="200" w:line="276" w:lineRule="auto"/>
-    </w:pPr>
   </w:style>
   <w:style w:type="character" w:default="1" w:styleId="DefaultParagraphFont">
     <w:name w:val="Default Paragraph Font"/>
@@ -2142,72 +2662,10 @@
     <w:basedOn w:val="DefaultParagraphFont"/>
     <w:uiPriority w:val="99"/>
     <w:semiHidden/>
-    <w:qFormat/>
     <w:rsid w:val="00013363"/>
     <w:rPr>
       <w:color w:val="808080"/>
     </w:rPr>
-  </w:style>
-  <w:style w:type="paragraph" w:customStyle="1" w:styleId="Heading">
-    <w:name w:val="Heading"/>
-    <w:basedOn w:val="Normal"/>
-    <w:next w:val="BodyText"/>
-    <w:qFormat/>
-    <w:pPr>
-      <w:keepNext/>
-      <w:spacing w:before="240" w:after="120"/>
-    </w:pPr>
-    <w:rPr>
-      <w:rFonts w:ascii="Liberation Sans" w:eastAsia="Noto Sans CJK SC" w:hAnsi="Liberation Sans" w:cs="Noto Sans Devanagari"/>
-      <w:sz w:val="28"/>
-      <w:szCs w:val="28"/>
-    </w:rPr>
-  </w:style>
-  <w:style w:type="paragraph" w:styleId="BodyText">
-    <w:name w:val="Body Text"/>
-    <w:basedOn w:val="Normal"/>
-    <w:pPr>
-      <w:spacing w:after="140"/>
-    </w:pPr>
-  </w:style>
-  <w:style w:type="paragraph" w:styleId="List">
-    <w:name w:val="List"/>
-    <w:basedOn w:val="BodyText"/>
-    <w:rPr>
-      <w:rFonts w:cs="Noto Sans Devanagari"/>
-    </w:rPr>
-  </w:style>
-  <w:style w:type="paragraph" w:styleId="Caption">
-    <w:name w:val="caption"/>
-    <w:basedOn w:val="Normal"/>
-    <w:qFormat/>
-    <w:pPr>
-      <w:suppressLineNumbers/>
-      <w:spacing w:before="120" w:after="120"/>
-    </w:pPr>
-    <w:rPr>
-      <w:rFonts w:cs="Noto Sans Devanagari"/>
-      <w:i/>
-      <w:iCs/>
-      <w:sz w:val="24"/>
-      <w:szCs w:val="24"/>
-    </w:rPr>
-  </w:style>
-  <w:style w:type="paragraph" w:customStyle="1" w:styleId="Index">
-    <w:name w:val="Index"/>
-    <w:basedOn w:val="Normal"/>
-    <w:qFormat/>
-    <w:pPr>
-      <w:suppressLineNumbers/>
-    </w:pPr>
-    <w:rPr>
-      <w:rFonts w:cs="Noto Sans Devanagari"/>
-    </w:rPr>
-  </w:style>
-  <w:style w:type="paragraph" w:customStyle="1" w:styleId="FrameContents">
-    <w:name w:val="Frame Contents"/>
-    <w:basedOn w:val="Normal"/>
-    <w:qFormat/>
   </w:style>
 </w:styles>
 </file>
@@ -2217,10 +2675,10 @@
   <a:themeElements>
     <a:clrScheme name="Office">
       <a:dk1>
-        <a:srgbClr val="000000"/>
+        <a:sysClr val="windowText" lastClr="000000"/>
       </a:dk1>
       <a:lt1>
-        <a:srgbClr val="FFFFFF"/>
+        <a:sysClr val="window" lastClr="FFFFFF"/>
       </a:lt1>
       <a:dk2>
         <a:srgbClr val="1F497D"/>
@@ -2258,128 +2716,236 @@
         <a:latin typeface="Cambria"/>
         <a:ea typeface=""/>
         <a:cs typeface=""/>
+        <a:font script="Jpan" typeface="ＭＳ ゴシック"/>
+        <a:font script="Hang" typeface="맑은 고딕"/>
+        <a:font script="Hans" typeface="宋体"/>
+        <a:font script="Hant" typeface="新細明體"/>
+        <a:font script="Arab" typeface="Times New Roman"/>
+        <a:font script="Hebr" typeface="Times New Roman"/>
+        <a:font script="Thai" typeface="Angsana New"/>
+        <a:font script="Ethi" typeface="Nyala"/>
+        <a:font script="Beng" typeface="Vrinda"/>
+        <a:font script="Gujr" typeface="Shruti"/>
+        <a:font script="Khmr" typeface="MoolBoran"/>
+        <a:font script="Knda" typeface="Tunga"/>
+        <a:font script="Guru" typeface="Raavi"/>
+        <a:font script="Cans" typeface="Euphemia"/>
+        <a:font script="Cher" typeface="Plantagenet Cherokee"/>
+        <a:font script="Yiii" typeface="Microsoft Yi Baiti"/>
+        <a:font script="Tibt" typeface="Microsoft Himalaya"/>
+        <a:font script="Thaa" typeface="MV Boli"/>
+        <a:font script="Deva" typeface="Mangal"/>
+        <a:font script="Telu" typeface="Gautami"/>
+        <a:font script="Taml" typeface="Latha"/>
+        <a:font script="Syrc" typeface="Estrangelo Edessa"/>
+        <a:font script="Orya" typeface="Kalinga"/>
+        <a:font script="Mlym" typeface="Kartika"/>
+        <a:font script="Laoo" typeface="DokChampa"/>
+        <a:font script="Sinh" typeface="Iskoola Pota"/>
+        <a:font script="Mong" typeface="Mongolian Baiti"/>
+        <a:font script="Viet" typeface="Times New Roman"/>
+        <a:font script="Uigh" typeface="Microsoft Uighur"/>
+        <a:font script="Geor" typeface="Sylfaen"/>
       </a:majorFont>
       <a:minorFont>
         <a:latin typeface="Calibri"/>
         <a:ea typeface=""/>
         <a:cs typeface=""/>
+        <a:font script="Jpan" typeface="ＭＳ 明朝"/>
+        <a:font script="Hang" typeface="맑은 고딕"/>
+        <a:font script="Hans" typeface="宋体"/>
+        <a:font script="Hant" typeface="新細明體"/>
+        <a:font script="Arab" typeface="Arial"/>
+        <a:font script="Hebr" typeface="Arial"/>
+        <a:font script="Thai" typeface="Cordia New"/>
+        <a:font script="Ethi" typeface="Nyala"/>
+        <a:font script="Beng" typeface="Vrinda"/>
+        <a:font script="Gujr" typeface="Shruti"/>
+        <a:font script="Khmr" typeface="DaunPenh"/>
+        <a:font script="Knda" typeface="Tunga"/>
+        <a:font script="Guru" typeface="Raavi"/>
+        <a:font script="Cans" typeface="Euphemia"/>
+        <a:font script="Cher" typeface="Plantagenet Cherokee"/>
+        <a:font script="Yiii" typeface="Microsoft Yi Baiti"/>
+        <a:font script="Tibt" typeface="Microsoft Himalaya"/>
+        <a:font script="Thaa" typeface="MV Boli"/>
+        <a:font script="Deva" typeface="Mangal"/>
+        <a:font script="Telu" typeface="Gautami"/>
+        <a:font script="Taml" typeface="Latha"/>
+        <a:font script="Syrc" typeface="Estrangelo Edessa"/>
+        <a:font script="Orya" typeface="Kalinga"/>
+        <a:font script="Mlym" typeface="Kartika"/>
+        <a:font script="Laoo" typeface="DokChampa"/>
+        <a:font script="Sinh" typeface="Iskoola Pota"/>
+        <a:font script="Mong" typeface="Mongolian Baiti"/>
+        <a:font script="Viet" typeface="Arial"/>
+        <a:font script="Uigh" typeface="Microsoft Uighur"/>
+        <a:font script="Geor" typeface="Sylfaen"/>
       </a:minorFont>
     </a:fontScheme>
-    <a:fmtScheme>
+    <a:fmtScheme name="Office">
       <a:fillStyleLst>
         <a:solidFill>
           <a:schemeClr val="phClr"/>
         </a:solidFill>
-        <a:gradFill>
+        <a:gradFill rotWithShape="1">
           <a:gsLst>
             <a:gs pos="0">
               <a:schemeClr val="phClr">
                 <a:tint val="50000"/>
+                <a:satMod val="300000"/>
               </a:schemeClr>
             </a:gs>
             <a:gs pos="35000">
               <a:schemeClr val="phClr">
                 <a:tint val="37000"/>
+                <a:satMod val="300000"/>
               </a:schemeClr>
             </a:gs>
             <a:gs pos="100000">
               <a:schemeClr val="phClr">
                 <a:tint val="15000"/>
+                <a:satMod val="350000"/>
               </a:schemeClr>
             </a:gs>
           </a:gsLst>
           <a:lin ang="16200000" scaled="1"/>
-          <a:tileRect/>
         </a:gradFill>
-        <a:gradFill>
+        <a:gradFill rotWithShape="1">
           <a:gsLst>
             <a:gs pos="0">
               <a:schemeClr val="phClr">
                 <a:shade val="51000"/>
+                <a:satMod val="130000"/>
               </a:schemeClr>
             </a:gs>
             <a:gs pos="80000">
               <a:schemeClr val="phClr">
                 <a:shade val="93000"/>
+                <a:satMod val="130000"/>
               </a:schemeClr>
             </a:gs>
             <a:gs pos="100000">
               <a:schemeClr val="phClr">
                 <a:shade val="94000"/>
+                <a:satMod val="135000"/>
               </a:schemeClr>
             </a:gs>
           </a:gsLst>
           <a:lin ang="16200000" scaled="0"/>
-          <a:tileRect/>
         </a:gradFill>
       </a:fillStyleLst>
       <a:lnStyleLst>
         <a:ln w="9525" cap="flat" cmpd="sng" algn="ctr">
+          <a:solidFill>
+            <a:schemeClr val="phClr">
+              <a:shade val="95000"/>
+              <a:satMod val="105000"/>
+            </a:schemeClr>
+          </a:solidFill>
           <a:prstDash val="solid"/>
         </a:ln>
         <a:ln w="25400" cap="flat" cmpd="sng" algn="ctr">
+          <a:solidFill>
+            <a:schemeClr val="phClr"/>
+          </a:solidFill>
           <a:prstDash val="solid"/>
         </a:ln>
         <a:ln w="38100" cap="flat" cmpd="sng" algn="ctr">
+          <a:solidFill>
+            <a:schemeClr val="phClr"/>
+          </a:solidFill>
           <a:prstDash val="solid"/>
         </a:ln>
       </a:lnStyleLst>
       <a:effectStyleLst>
         <a:effectStyle>
-          <a:effectLst/>
+          <a:effectLst>
+            <a:outerShdw blurRad="40000" dist="20000" dir="5400000" rotWithShape="0">
+              <a:srgbClr val="000000">
+                <a:alpha val="38000"/>
+              </a:srgbClr>
+            </a:outerShdw>
+          </a:effectLst>
         </a:effectStyle>
         <a:effectStyle>
-          <a:effectLst/>
+          <a:effectLst>
+            <a:outerShdw blurRad="40000" dist="23000" dir="5400000" rotWithShape="0">
+              <a:srgbClr val="000000">
+                <a:alpha val="35000"/>
+              </a:srgbClr>
+            </a:outerShdw>
+          </a:effectLst>
         </a:effectStyle>
         <a:effectStyle>
-          <a:effectLst/>
+          <a:effectLst>
+            <a:outerShdw blurRad="40000" dist="23000" dir="5400000" rotWithShape="0">
+              <a:srgbClr val="000000">
+                <a:alpha val="35000"/>
+              </a:srgbClr>
+            </a:outerShdw>
+          </a:effectLst>
+          <a:scene3d>
+            <a:camera prst="orthographicFront">
+              <a:rot lat="0" lon="0" rev="0"/>
+            </a:camera>
+            <a:lightRig rig="threePt" dir="t">
+              <a:rot lat="0" lon="0" rev="1200000"/>
+            </a:lightRig>
+          </a:scene3d>
+          <a:sp3d>
+            <a:bevelT w="63500" h="25400"/>
+          </a:sp3d>
         </a:effectStyle>
       </a:effectStyleLst>
       <a:bgFillStyleLst>
         <a:solidFill>
           <a:schemeClr val="phClr"/>
         </a:solidFill>
-        <a:gradFill>
+        <a:gradFill rotWithShape="1">
           <a:gsLst>
             <a:gs pos="0">
               <a:schemeClr val="phClr">
                 <a:tint val="40000"/>
+                <a:satMod val="350000"/>
               </a:schemeClr>
             </a:gs>
             <a:gs pos="40000">
               <a:schemeClr val="phClr">
                 <a:tint val="45000"/>
                 <a:shade val="99000"/>
+                <a:satMod val="350000"/>
               </a:schemeClr>
             </a:gs>
             <a:gs pos="100000">
               <a:schemeClr val="phClr">
                 <a:shade val="20000"/>
+                <a:satMod val="255000"/>
               </a:schemeClr>
             </a:gs>
           </a:gsLst>
           <a:path path="circle">
             <a:fillToRect l="50000" t="-80000" r="50000" b="180000"/>
           </a:path>
-          <a:tileRect/>
         </a:gradFill>
-        <a:gradFill>
+        <a:gradFill rotWithShape="1">
           <a:gsLst>
             <a:gs pos="0">
               <a:schemeClr val="phClr">
                 <a:tint val="80000"/>
+                <a:satMod val="300000"/>
               </a:schemeClr>
             </a:gs>
             <a:gs pos="100000">
               <a:schemeClr val="phClr">
                 <a:shade val="30000"/>
+                <a:satMod val="200000"/>
               </a:schemeClr>
             </a:gs>
           </a:gsLst>
           <a:path path="circle">
             <a:fillToRect l="50000" t="50000" r="50000" b="50000"/>
           </a:path>
-          <a:tileRect/>
         </a:gradFill>
       </a:bgFillStyleLst>
     </a:fmtScheme>

</xml_diff>

<commit_message>
allow rollback to filled xlsx
</commit_message>
<xml_diff>
--- a/res/Recht om te vertegenwoordigen.docx
+++ b/res/Recht om te vertegenwoordigen.docx
@@ -1,6 +1,6 @@
 
 <file path=word/document.xml><?xml version="1.0" encoding="utf-8"?>
-<w:document xmlns:wpc="http://schemas.microsoft.com/office/word/2010/wordprocessingCanvas" xmlns:cx="http://schemas.microsoft.com/office/drawing/2014/chartex" xmlns:cx1="http://schemas.microsoft.com/office/drawing/2015/9/8/chartex" xmlns:cx2="http://schemas.microsoft.com/office/drawing/2015/10/21/chartex" xmlns:cx3="http://schemas.microsoft.com/office/drawing/2016/5/9/chartex" xmlns:cx4="http://schemas.microsoft.com/office/drawing/2016/5/10/chartex" xmlns:cx5="http://schemas.microsoft.com/office/drawing/2016/5/11/chartex" xmlns:cx6="http://schemas.microsoft.com/office/drawing/2016/5/12/chartex" xmlns:cx7="http://schemas.microsoft.com/office/drawing/2016/5/13/chartex" xmlns:cx8="http://schemas.microsoft.com/office/drawing/2016/5/14/chartex" xmlns:mc="http://schemas.openxmlformats.org/markup-compatibility/2006" xmlns:aink="http://schemas.microsoft.com/office/drawing/2016/ink" xmlns:am3d="http://schemas.microsoft.com/office/drawing/2017/model3d" xmlns:o="urn:schemas-microsoft-com:office:office" xmlns:oel="http://schemas.microsoft.com/office/2019/extlst" xmlns:r="http://schemas.openxmlformats.org/officeDocument/2006/relationships" xmlns:m="http://schemas.openxmlformats.org/officeDocument/2006/math" xmlns:v="urn:schemas-microsoft-com:vml" xmlns:wp14="http://schemas.microsoft.com/office/word/2010/wordprocessingDrawing" xmlns:wp="http://schemas.openxmlformats.org/drawingml/2006/wordprocessingDrawing" xmlns:w10="urn:schemas-microsoft-com:office:word" xmlns:w="http://schemas.openxmlformats.org/wordprocessingml/2006/main" xmlns:w14="http://schemas.microsoft.com/office/word/2010/wordml" xmlns:w15="http://schemas.microsoft.com/office/word/2012/wordml" xmlns:w16cex="http://schemas.microsoft.com/office/word/2018/wordml/cex" xmlns:w16cid="http://schemas.microsoft.com/office/word/2016/wordml/cid" xmlns:w16="http://schemas.microsoft.com/office/word/2018/wordml" xmlns:w16sdtdh="http://schemas.microsoft.com/office/word/2020/wordml/sdtdatahash" xmlns:w16se="http://schemas.microsoft.com/office/word/2015/wordml/symex" xmlns:wpg="http://schemas.microsoft.com/office/word/2010/wordprocessingGroup" xmlns:wpi="http://schemas.microsoft.com/office/word/2010/wordprocessingInk" xmlns:wne="http://schemas.microsoft.com/office/word/2006/wordml" xmlns:wps="http://schemas.microsoft.com/office/word/2010/wordprocessingShape" mc:Ignorable="w14 w15 w16se w16cid w16 w16cex w16sdtdh wp14">
+<w:document xmlns:wpc="http://schemas.microsoft.com/office/word/2010/wordprocessingCanvas" xmlns:cx="http://schemas.microsoft.com/office/drawing/2014/chartex" xmlns:cx1="http://schemas.microsoft.com/office/drawing/2015/9/8/chartex" xmlns:cx2="http://schemas.microsoft.com/office/drawing/2015/10/21/chartex" xmlns:cx3="http://schemas.microsoft.com/office/drawing/2016/5/9/chartex" xmlns:cx4="http://schemas.microsoft.com/office/drawing/2016/5/10/chartex" xmlns:cx5="http://schemas.microsoft.com/office/drawing/2016/5/11/chartex" xmlns:cx6="http://schemas.microsoft.com/office/drawing/2016/5/12/chartex" xmlns:cx7="http://schemas.microsoft.com/office/drawing/2016/5/13/chartex" xmlns:cx8="http://schemas.microsoft.com/office/drawing/2016/5/14/chartex" xmlns:mc="http://schemas.openxmlformats.org/markup-compatibility/2006" xmlns:aink="http://schemas.microsoft.com/office/drawing/2016/ink" xmlns:am3d="http://schemas.microsoft.com/office/drawing/2017/model3d" xmlns:o="urn:schemas-microsoft-com:office:office" xmlns:oel="http://schemas.microsoft.com/office/2019/extlst" xmlns:r="http://schemas.openxmlformats.org/officeDocument/2006/relationships" xmlns:m="http://schemas.openxmlformats.org/officeDocument/2006/math" xmlns:v="urn:schemas-microsoft-com:vml" xmlns:wp14="http://schemas.microsoft.com/office/word/2010/wordprocessingDrawing" xmlns:wp="http://schemas.openxmlformats.org/drawingml/2006/wordprocessingDrawing" xmlns:w10="urn:schemas-microsoft-com:office:word" xmlns:w="http://schemas.openxmlformats.org/wordprocessingml/2006/main" xmlns:w14="http://schemas.microsoft.com/office/word/2010/wordml" xmlns:w15="http://schemas.microsoft.com/office/word/2012/wordml" xmlns:w16cex="http://schemas.microsoft.com/office/word/2018/wordml/cex" xmlns:w16cid="http://schemas.microsoft.com/office/word/2016/wordml/cid" xmlns:w16="http://schemas.microsoft.com/office/word/2018/wordml" xmlns:w16du="http://schemas.microsoft.com/office/word/2023/wordml/word16du" xmlns:w16sdtdh="http://schemas.microsoft.com/office/word/2020/wordml/sdtdatahash" xmlns:w16sdtfl="http://schemas.microsoft.com/office/word/2024/wordml/sdtformatlock" xmlns:w16se="http://schemas.microsoft.com/office/word/2015/wordml/symex" xmlns:wpg="http://schemas.microsoft.com/office/word/2010/wordprocessingGroup" xmlns:wpi="http://schemas.microsoft.com/office/word/2010/wordprocessingInk" xmlns:wne="http://schemas.microsoft.com/office/word/2006/wordml" xmlns:wps="http://schemas.microsoft.com/office/word/2010/wordprocessingShape" mc:Ignorable="w14 w15 w16se w16cid w16 w16cex w16sdtdh w16sdtfl w16du wp14">
   <w:body>
     <w:p>
       <w:pPr>
@@ -27,7 +27,7 @@
           <w:sz w:val="24"/>
           <w:szCs w:val="24"/>
         </w:rPr>
-        <w:instrText xml:space="preserve"> DATE   \* MERGEFORMAT </w:instrText>
+        <w:instrText xml:space="preserve"> DATE  \@ "dd/MM/yyyy"  \* MERGEFORMAT </w:instrText>
       </w:r>
       <w:r>
         <w:rPr>
@@ -46,7 +46,7 @@
           <w:sz w:val="24"/>
           <w:szCs w:val="24"/>
         </w:rPr>
-        <w:t>20/12/2023</w:t>
+        <w:t>22/03/2025</w:t>
       </w:r>
       <w:r>
         <w:rPr>
@@ -150,15 +150,17 @@
         </w:rPr>
         <w:fldChar w:fldCharType="separate"/>
       </w:r>
-      <w:r>
-        <w:rPr>
-          <w:rFonts w:ascii="Calibri" w:eastAsia="Calibri" w:hAnsi="Calibri" w:cs="Times New Roman"/>
-          <w:b/>
-          <w:sz w:val="24"/>
-          <w:szCs w:val="24"/>
-        </w:rPr>
-        <w:t>******</w:t>
-      </w:r>
+      <w:proofErr w:type="spellStart"/>
+      <w:r>
+        <w:rPr>
+          <w:rFonts w:ascii="Calibri" w:eastAsia="Calibri" w:hAnsi="Calibri" w:cs="Times New Roman"/>
+          <w:b/>
+          <w:sz w:val="24"/>
+          <w:szCs w:val="24"/>
+        </w:rPr>
+        <w:t>LeverancierNaam</w:t>
+      </w:r>
+      <w:proofErr w:type="spellEnd"/>
       <w:r>
         <w:rPr>
           <w:rFonts w:ascii="Calibri" w:eastAsia="Calibri" w:hAnsi="Calibri" w:cs="Times New Roman"/>
@@ -203,14 +205,16 @@
         </w:rPr>
         <w:fldChar w:fldCharType="separate"/>
       </w:r>
-      <w:r>
-        <w:rPr>
-          <w:rFonts w:ascii="Calibri" w:eastAsia="Calibri" w:hAnsi="Calibri" w:cs="Times New Roman"/>
-          <w:sz w:val="24"/>
-          <w:szCs w:val="24"/>
-        </w:rPr>
-        <w:t>******</w:t>
-      </w:r>
+      <w:proofErr w:type="spellStart"/>
+      <w:r>
+        <w:rPr>
+          <w:rFonts w:ascii="Calibri" w:eastAsia="Calibri" w:hAnsi="Calibri" w:cs="Times New Roman"/>
+          <w:sz w:val="24"/>
+          <w:szCs w:val="24"/>
+        </w:rPr>
+        <w:t>LeverancierStraat</w:t>
+      </w:r>
+      <w:proofErr w:type="spellEnd"/>
       <w:r>
         <w:rPr>
           <w:rFonts w:ascii="Calibri" w:eastAsia="Calibri" w:hAnsi="Calibri" w:cs="Times New Roman"/>
@@ -254,14 +258,16 @@
         </w:rPr>
         <w:fldChar w:fldCharType="separate"/>
       </w:r>
-      <w:r>
-        <w:rPr>
-          <w:rFonts w:ascii="Calibri" w:eastAsia="Calibri" w:hAnsi="Calibri" w:cs="Times New Roman"/>
-          <w:sz w:val="24"/>
-          <w:szCs w:val="24"/>
-        </w:rPr>
-        <w:t>******</w:t>
-      </w:r>
+      <w:proofErr w:type="spellStart"/>
+      <w:r>
+        <w:rPr>
+          <w:rFonts w:ascii="Calibri" w:eastAsia="Calibri" w:hAnsi="Calibri" w:cs="Times New Roman"/>
+          <w:sz w:val="24"/>
+          <w:szCs w:val="24"/>
+        </w:rPr>
+        <w:t>LeverancierStad</w:t>
+      </w:r>
+      <w:proofErr w:type="spellEnd"/>
       <w:r>
         <w:rPr>
           <w:rFonts w:ascii="Calibri" w:eastAsia="Calibri" w:hAnsi="Calibri" w:cs="Times New Roman"/>
@@ -400,7 +406,7 @@
           <w:sz w:val="24"/>
           <w:szCs w:val="24"/>
         </w:rPr>
-        <w:instrText xml:space="preserve"> DATE   \* MERGEFORMAT </w:instrText>
+        <w:instrText xml:space="preserve"> DATE  \@ "dd/MM/yyyy"  \* MERGEFORMAT </w:instrText>
       </w:r>
       <w:r>
         <w:rPr>
@@ -419,7 +425,7 @@
           <w:sz w:val="24"/>
           <w:szCs w:val="24"/>
         </w:rPr>
-        <w:t>20/12/2023</w:t>
+        <w:t>22/03/2025</w:t>
       </w:r>
       <w:r>
         <w:rPr>
@@ -501,15 +507,17 @@
         </w:rPr>
         <w:fldChar w:fldCharType="separate"/>
       </w:r>
-      <w:r>
-        <w:rPr>
-          <w:rFonts w:ascii="Calibri" w:eastAsia="Calibri" w:hAnsi="Calibri" w:cs="Times New Roman"/>
-          <w:b/>
-          <w:sz w:val="24"/>
-          <w:szCs w:val="24"/>
-        </w:rPr>
-        <w:t>******</w:t>
-      </w:r>
+      <w:proofErr w:type="spellStart"/>
+      <w:r>
+        <w:rPr>
+          <w:rFonts w:ascii="Calibri" w:eastAsia="Calibri" w:hAnsi="Calibri" w:cs="Times New Roman"/>
+          <w:b/>
+          <w:sz w:val="24"/>
+          <w:szCs w:val="24"/>
+        </w:rPr>
+        <w:t>LeverancierNaam</w:t>
+      </w:r>
+      <w:proofErr w:type="spellEnd"/>
       <w:r>
         <w:rPr>
           <w:rFonts w:ascii="Calibri" w:eastAsia="Calibri" w:hAnsi="Calibri" w:cs="Times New Roman"/>
@@ -581,15 +589,17 @@
         </w:rPr>
         <w:fldChar w:fldCharType="separate"/>
       </w:r>
-      <w:r>
-        <w:rPr>
-          <w:rFonts w:ascii="Calibri" w:eastAsia="Calibri" w:hAnsi="Calibri" w:cs="Times New Roman"/>
-          <w:b/>
-          <w:sz w:val="24"/>
-          <w:szCs w:val="24"/>
-        </w:rPr>
-        <w:t>******</w:t>
-      </w:r>
+      <w:proofErr w:type="spellStart"/>
+      <w:r>
+        <w:rPr>
+          <w:rFonts w:ascii="Calibri" w:eastAsia="Calibri" w:hAnsi="Calibri" w:cs="Times New Roman"/>
+          <w:b/>
+          <w:sz w:val="24"/>
+          <w:szCs w:val="24"/>
+        </w:rPr>
+        <w:t>LeverancierPostadres</w:t>
+      </w:r>
+      <w:proofErr w:type="spellEnd"/>
       <w:r>
         <w:rPr>
           <w:rFonts w:ascii="Calibri" w:eastAsia="Calibri" w:hAnsi="Calibri" w:cs="Times New Roman"/>
@@ -663,16 +673,18 @@
         </w:rPr>
         <w:fldChar w:fldCharType="separate"/>
       </w:r>
-      <w:r>
-        <w:rPr>
-          <w:rFonts w:ascii="Calibri" w:eastAsia="Calibri" w:hAnsi="Calibri" w:cs="Times New Roman"/>
-          <w:b/>
-          <w:bCs/>
-          <w:sz w:val="24"/>
-          <w:szCs w:val="24"/>
-        </w:rPr>
-        <w:t>******</w:t>
-      </w:r>
+      <w:proofErr w:type="spellStart"/>
+      <w:r>
+        <w:rPr>
+          <w:rFonts w:ascii="Calibri" w:eastAsia="Calibri" w:hAnsi="Calibri" w:cs="Times New Roman"/>
+          <w:b/>
+          <w:bCs/>
+          <w:sz w:val="24"/>
+          <w:szCs w:val="24"/>
+        </w:rPr>
+        <w:t>LeverancierKandidaat</w:t>
+      </w:r>
+      <w:proofErr w:type="spellEnd"/>
       <w:r>
         <w:rPr>
           <w:rFonts w:ascii="Calibri" w:eastAsia="Calibri" w:hAnsi="Calibri" w:cs="Times New Roman"/>
@@ -763,15 +775,17 @@
         </w:rPr>
         <w:fldChar w:fldCharType="separate"/>
       </w:r>
-      <w:r>
-        <w:rPr>
-          <w:rFonts w:ascii="Calibri" w:eastAsia="Calibri" w:hAnsi="Calibri" w:cs="Times New Roman"/>
-          <w:b/>
-          <w:sz w:val="24"/>
-          <w:szCs w:val="24"/>
-        </w:rPr>
-        <w:t>******</w:t>
-      </w:r>
+      <w:proofErr w:type="spellStart"/>
+      <w:r>
+        <w:rPr>
+          <w:rFonts w:ascii="Calibri" w:eastAsia="Calibri" w:hAnsi="Calibri" w:cs="Times New Roman"/>
+          <w:b/>
+          <w:sz w:val="24"/>
+          <w:szCs w:val="24"/>
+        </w:rPr>
+        <w:t>LeverancierHoedanigheid</w:t>
+      </w:r>
+      <w:proofErr w:type="spellEnd"/>
       <w:r>
         <w:rPr>
           <w:rFonts w:ascii="Calibri" w:eastAsia="Calibri" w:hAnsi="Calibri" w:cs="Times New Roman"/>
@@ -878,15 +892,17 @@
         </w:rPr>
         <w:fldChar w:fldCharType="separate"/>
       </w:r>
-      <w:r>
-        <w:rPr>
-          <w:rFonts w:ascii="Calibri" w:eastAsia="Calibri" w:hAnsi="Calibri" w:cs="Times New Roman"/>
-          <w:b/>
-          <w:sz w:val="24"/>
-          <w:szCs w:val="24"/>
-        </w:rPr>
-        <w:t>******</w:t>
-      </w:r>
+      <w:proofErr w:type="spellStart"/>
+      <w:r>
+        <w:rPr>
+          <w:rFonts w:ascii="Calibri" w:eastAsia="Calibri" w:hAnsi="Calibri" w:cs="Times New Roman"/>
+          <w:b/>
+          <w:sz w:val="24"/>
+          <w:szCs w:val="24"/>
+        </w:rPr>
+        <w:t>LeverancierNaam</w:t>
+      </w:r>
+      <w:proofErr w:type="spellEnd"/>
       <w:r>
         <w:rPr>
           <w:rFonts w:ascii="Calibri" w:eastAsia="Calibri" w:hAnsi="Calibri" w:cs="Times New Roman"/>
@@ -960,16 +976,18 @@
         </w:rPr>
         <w:fldChar w:fldCharType="separate"/>
       </w:r>
-      <w:r>
-        <w:rPr>
-          <w:rFonts w:ascii="Calibri" w:eastAsia="Calibri" w:hAnsi="Calibri" w:cs="Times New Roman"/>
-          <w:b/>
-          <w:bCs/>
-          <w:sz w:val="24"/>
-          <w:szCs w:val="24"/>
-        </w:rPr>
-        <w:t>******</w:t>
-      </w:r>
+      <w:proofErr w:type="spellStart"/>
+      <w:r>
+        <w:rPr>
+          <w:rFonts w:ascii="Calibri" w:eastAsia="Calibri" w:hAnsi="Calibri" w:cs="Times New Roman"/>
+          <w:b/>
+          <w:bCs/>
+          <w:sz w:val="24"/>
+          <w:szCs w:val="24"/>
+        </w:rPr>
+        <w:t>KlantNaam</w:t>
+      </w:r>
+      <w:proofErr w:type="spellEnd"/>
       <w:r>
         <w:rPr>
           <w:rFonts w:ascii="Calibri" w:eastAsia="Calibri" w:hAnsi="Calibri" w:cs="Times New Roman"/>
@@ -1036,16 +1054,18 @@
         </w:rPr>
         <w:fldChar w:fldCharType="separate"/>
       </w:r>
-      <w:r>
-        <w:rPr>
-          <w:rFonts w:ascii="Calibri" w:eastAsia="Calibri" w:hAnsi="Calibri" w:cs="Times New Roman"/>
-          <w:b/>
-          <w:bCs/>
-          <w:sz w:val="24"/>
-          <w:szCs w:val="24"/>
-        </w:rPr>
-        <w:t>******</w:t>
-      </w:r>
+      <w:proofErr w:type="spellStart"/>
+      <w:r>
+        <w:rPr>
+          <w:rFonts w:ascii="Calibri" w:eastAsia="Calibri" w:hAnsi="Calibri" w:cs="Times New Roman"/>
+          <w:b/>
+          <w:bCs/>
+          <w:sz w:val="24"/>
+          <w:szCs w:val="24"/>
+        </w:rPr>
+        <w:t>KlantJobReference</w:t>
+      </w:r>
+      <w:proofErr w:type="spellEnd"/>
       <w:r>
         <w:rPr>
           <w:rFonts w:ascii="Calibri" w:eastAsia="Calibri" w:hAnsi="Calibri" w:cs="Times New Roman"/>
@@ -1076,6 +1096,7 @@
         </w:rPr>
         <w:t>(</w:t>
       </w:r>
+      <w:proofErr w:type="spellStart"/>
       <w:r>
         <w:rPr>
           <w:rFonts w:ascii="Calibri" w:eastAsia="Calibri" w:hAnsi="Calibri" w:cs="Times New Roman"/>
@@ -1114,8 +1135,9 @@
           <w:sz w:val="24"/>
           <w:szCs w:val="24"/>
         </w:rPr>
-        <w:t>******</w:t>
-      </w:r>
+        <w:t>KlantJobTitle</w:t>
+      </w:r>
+      <w:proofErr w:type="spellEnd"/>
       <w:r>
         <w:rPr>
           <w:rFonts w:ascii="Calibri" w:eastAsia="Calibri" w:hAnsi="Calibri" w:cs="Times New Roman"/>
@@ -1323,16 +1345,18 @@
         </w:rPr>
         <w:fldChar w:fldCharType="separate"/>
       </w:r>
-      <w:r>
-        <w:rPr>
-          <w:rFonts w:ascii="Calibri" w:eastAsia="Calibri" w:hAnsi="Calibri" w:cs="Times New Roman"/>
-          <w:b/>
-          <w:bCs/>
-          <w:sz w:val="24"/>
-          <w:szCs w:val="24"/>
-        </w:rPr>
-        <w:t>******</w:t>
-      </w:r>
+      <w:proofErr w:type="spellStart"/>
+      <w:r>
+        <w:rPr>
+          <w:rFonts w:ascii="Calibri" w:eastAsia="Calibri" w:hAnsi="Calibri" w:cs="Times New Roman"/>
+          <w:b/>
+          <w:bCs/>
+          <w:sz w:val="24"/>
+          <w:szCs w:val="24"/>
+        </w:rPr>
+        <w:t>LeverancierOpgemaaktte</w:t>
+      </w:r>
+      <w:proofErr w:type="spellEnd"/>
       <w:r>
         <w:rPr>
           <w:rFonts w:ascii="Calibri" w:eastAsia="Calibri" w:hAnsi="Calibri" w:cs="Times New Roman"/>
@@ -1418,7 +1442,7 @@
           <w:sz w:val="24"/>
           <w:szCs w:val="24"/>
         </w:rPr>
-        <w:instrText xml:space="preserve"> DATE   \* MERGEFORMAT </w:instrText>
+        <w:instrText xml:space="preserve"> DATE  \@ "dd/MM/yyyy"  \* MERGEFORMAT </w:instrText>
       </w:r>
       <w:r>
         <w:rPr>
@@ -1437,7 +1461,7 @@
           <w:sz w:val="24"/>
           <w:szCs w:val="24"/>
         </w:rPr>
-        <w:t>20/12/2023</w:t>
+        <w:t>22/03/2025</w:t>
       </w:r>
       <w:r>
         <w:rPr>
@@ -1633,10 +1657,10 @@
                                 <w:szCs w:val="24"/>
                               </w:rPr>
                               <w:drawing>
-                                <wp:inline distT="0" distB="0" distL="0" distR="0" wp14:anchorId="508DD847" wp14:editId="44AC7A97">
-                                  <wp:extent cx="2170118" cy="1266523"/>
-                                  <wp:effectExtent l="0" t="0" r="1905" b="0"/>
-                                  <wp:docPr id="4" name="Picture 4" descr="A close up of a device&#10;&#10;Description automatically generated"/>
+                                <wp:inline distT="0" distB="0" distL="0" distR="0" wp14:anchorId="508DD847" wp14:editId="28BA63C4">
+                                  <wp:extent cx="2178124" cy="1221484"/>
+                                  <wp:effectExtent l="0" t="0" r="0" b="0"/>
+                                  <wp:docPr id="4" name="Picture 4" descr="signatureRight"/>
                                   <wp:cNvGraphicFramePr>
                                     <a:graphicFrameLocks xmlns:a="http://schemas.openxmlformats.org/drawingml/2006/main" noChangeAspect="1"/>
                                   </wp:cNvGraphicFramePr>
@@ -1644,7 +1668,7 @@
                                     <a:graphicData uri="http://schemas.openxmlformats.org/drawingml/2006/picture">
                                       <pic:pic xmlns:pic="http://schemas.openxmlformats.org/drawingml/2006/picture">
                                         <pic:nvPicPr>
-                                          <pic:cNvPr id="1" name="JohanSign.jpg"/>
+                                          <pic:cNvPr id="4" name="Picture 4" descr="signatureRight"/>
                                           <pic:cNvPicPr/>
                                         </pic:nvPicPr>
                                         <pic:blipFill>
@@ -1662,7 +1686,7 @@
                                         <pic:spPr>
                                           <a:xfrm>
                                             <a:off x="0" y="0"/>
-                                            <a:ext cx="2178124" cy="1271195"/>
+                                            <a:ext cx="2178124" cy="1221484"/>
                                           </a:xfrm>
                                           <a:prstGeom prst="rect">
                                             <a:avLst/>
@@ -1716,10 +1740,10 @@
                           <w:szCs w:val="24"/>
                         </w:rPr>
                         <w:drawing>
-                          <wp:inline distT="0" distB="0" distL="0" distR="0" wp14:anchorId="508DD847" wp14:editId="44AC7A97">
-                            <wp:extent cx="2170118" cy="1266523"/>
-                            <wp:effectExtent l="0" t="0" r="1905" b="0"/>
-                            <wp:docPr id="4" name="Picture 4" descr="A close up of a device&#10;&#10;Description automatically generated"/>
+                          <wp:inline distT="0" distB="0" distL="0" distR="0" wp14:anchorId="508DD847" wp14:editId="28BA63C4">
+                            <wp:extent cx="2178124" cy="1221484"/>
+                            <wp:effectExtent l="0" t="0" r="0" b="0"/>
+                            <wp:docPr id="4" name="Picture 4" descr="signatureRight"/>
                             <wp:cNvGraphicFramePr>
                               <a:graphicFrameLocks xmlns:a="http://schemas.openxmlformats.org/drawingml/2006/main" noChangeAspect="1"/>
                             </wp:cNvGraphicFramePr>
@@ -1727,7 +1751,7 @@
                               <a:graphicData uri="http://schemas.openxmlformats.org/drawingml/2006/picture">
                                 <pic:pic xmlns:pic="http://schemas.openxmlformats.org/drawingml/2006/picture">
                                   <pic:nvPicPr>
-                                    <pic:cNvPr id="1" name="JohanSign.jpg"/>
+                                    <pic:cNvPr id="4" name="Picture 4" descr="signatureRight"/>
                                     <pic:cNvPicPr/>
                                   </pic:nvPicPr>
                                   <pic:blipFill>
@@ -1745,7 +1769,7 @@
                                   <pic:spPr>
                                     <a:xfrm>
                                       <a:off x="0" y="0"/>
-                                      <a:ext cx="2178124" cy="1271195"/>
+                                      <a:ext cx="2178124" cy="1221484"/>
                                     </a:xfrm>
                                     <a:prstGeom prst="rect">
                                       <a:avLst/>
@@ -1828,10 +1852,10 @@
                                 <w:szCs w:val="24"/>
                               </w:rPr>
                               <w:drawing>
-                                <wp:inline distT="0" distB="0" distL="0" distR="0" wp14:anchorId="09A3492C" wp14:editId="26F65A41">
-                                  <wp:extent cx="2089785" cy="1171996"/>
+                                <wp:inline distT="0" distB="0" distL="0" distR="0" wp14:anchorId="09A3492C" wp14:editId="13C11D66">
+                                  <wp:extent cx="2089785" cy="1171944"/>
                                   <wp:effectExtent l="0" t="0" r="5715" b="9525"/>
-                                  <wp:docPr id="2" name="Picture 2" descr="A close up of a device&#10;&#10;Description automatically generated"/>
+                                  <wp:docPr id="2" name="Picture 2" descr="signatureLeft"/>
                                   <wp:cNvGraphicFramePr>
                                     <a:graphicFrameLocks xmlns:a="http://schemas.openxmlformats.org/drawingml/2006/main" noChangeAspect="1"/>
                                   </wp:cNvGraphicFramePr>
@@ -1839,7 +1863,7 @@
                                     <a:graphicData uri="http://schemas.openxmlformats.org/drawingml/2006/picture">
                                       <pic:pic xmlns:pic="http://schemas.openxmlformats.org/drawingml/2006/picture">
                                         <pic:nvPicPr>
-                                          <pic:cNvPr id="1" name="JohanSign.jpg"/>
+                                          <pic:cNvPr id="2" name="Picture 2" descr="signatureLeft"/>
                                           <pic:cNvPicPr/>
                                         </pic:nvPicPr>
                                         <pic:blipFill>
@@ -1857,7 +1881,7 @@
                                         <pic:spPr>
                                           <a:xfrm>
                                             <a:off x="0" y="0"/>
-                                            <a:ext cx="2089785" cy="1171996"/>
+                                            <a:ext cx="2089785" cy="1171944"/>
                                           </a:xfrm>
                                           <a:prstGeom prst="rect">
                                             <a:avLst/>
@@ -1907,10 +1931,10 @@
                           <w:szCs w:val="24"/>
                         </w:rPr>
                         <w:drawing>
-                          <wp:inline distT="0" distB="0" distL="0" distR="0" wp14:anchorId="09A3492C" wp14:editId="26F65A41">
-                            <wp:extent cx="2089785" cy="1171996"/>
+                          <wp:inline distT="0" distB="0" distL="0" distR="0" wp14:anchorId="09A3492C" wp14:editId="13C11D66">
+                            <wp:extent cx="2089785" cy="1171944"/>
                             <wp:effectExtent l="0" t="0" r="5715" b="9525"/>
-                            <wp:docPr id="2" name="Picture 2" descr="A close up of a device&#10;&#10;Description automatically generated"/>
+                            <wp:docPr id="2" name="Picture 2" descr="signatureLeft"/>
                             <wp:cNvGraphicFramePr>
                               <a:graphicFrameLocks xmlns:a="http://schemas.openxmlformats.org/drawingml/2006/main" noChangeAspect="1"/>
                             </wp:cNvGraphicFramePr>
@@ -1918,7 +1942,7 @@
                               <a:graphicData uri="http://schemas.openxmlformats.org/drawingml/2006/picture">
                                 <pic:pic xmlns:pic="http://schemas.openxmlformats.org/drawingml/2006/picture">
                                   <pic:nvPicPr>
-                                    <pic:cNvPr id="1" name="JohanSign.jpg"/>
+                                    <pic:cNvPr id="2" name="Picture 2" descr="signatureLeft"/>
                                     <pic:cNvPicPr/>
                                   </pic:nvPicPr>
                                   <pic:blipFill>
@@ -1936,7 +1960,7 @@
                                   <pic:spPr>
                                     <a:xfrm>
                                       <a:off x="0" y="0"/>
-                                      <a:ext cx="2089785" cy="1171996"/>
+                                      <a:ext cx="2089785" cy="1171944"/>
                                     </a:xfrm>
                                     <a:prstGeom prst="rect">
                                       <a:avLst/>
@@ -2078,6 +2102,7 @@
         </w:rPr>
         <w:fldChar w:fldCharType="separate"/>
       </w:r>
+      <w:proofErr w:type="spellStart"/>
       <w:r>
         <w:rPr>
           <w:rFonts w:ascii="Calibri" w:eastAsia="Calibri" w:hAnsi="Calibri" w:cs="Times New Roman"/>
@@ -2087,8 +2112,9 @@
           <w:szCs w:val="24"/>
           <w:lang w:val="en-GB"/>
         </w:rPr>
-        <w:t>******</w:t>
-      </w:r>
+        <w:t>LeverancierKandidaat</w:t>
+      </w:r>
+      <w:proofErr w:type="spellEnd"/>
       <w:r>
         <w:rPr>
           <w:rFonts w:ascii="Calibri" w:eastAsia="Calibri" w:hAnsi="Calibri" w:cs="Times New Roman"/>
@@ -2189,6 +2215,7 @@
         </w:rPr>
         <w:fldChar w:fldCharType="separate"/>
       </w:r>
+      <w:proofErr w:type="spellStart"/>
       <w:r>
         <w:rPr>
           <w:rFonts w:ascii="Calibri" w:eastAsia="Calibri" w:hAnsi="Calibri" w:cs="Times New Roman"/>
@@ -2198,8 +2225,9 @@
           <w:szCs w:val="24"/>
           <w:lang w:val="en-GB"/>
         </w:rPr>
-        <w:t>******</w:t>
-      </w:r>
+        <w:t>LeverancierNaam</w:t>
+      </w:r>
+      <w:proofErr w:type="spellEnd"/>
       <w:r>
         <w:rPr>
           <w:rFonts w:ascii="Calibri" w:eastAsia="Calibri" w:hAnsi="Calibri" w:cs="Times New Roman"/>
@@ -2232,7 +2260,7 @@
 </file>
 
 <file path=word/styles.xml><?xml version="1.0" encoding="utf-8"?>
-<w:styles xmlns:mc="http://schemas.openxmlformats.org/markup-compatibility/2006" xmlns:r="http://schemas.openxmlformats.org/officeDocument/2006/relationships" xmlns:w="http://schemas.openxmlformats.org/wordprocessingml/2006/main" xmlns:w14="http://schemas.microsoft.com/office/word/2010/wordml" xmlns:w15="http://schemas.microsoft.com/office/word/2012/wordml" xmlns:w16cex="http://schemas.microsoft.com/office/word/2018/wordml/cex" xmlns:w16cid="http://schemas.microsoft.com/office/word/2016/wordml/cid" xmlns:w16="http://schemas.microsoft.com/office/word/2018/wordml" xmlns:w16sdtdh="http://schemas.microsoft.com/office/word/2020/wordml/sdtdatahash" xmlns:w16se="http://schemas.microsoft.com/office/word/2015/wordml/symex" mc:Ignorable="w14 w15 w16se w16cid w16 w16cex w16sdtdh">
+<w:styles xmlns:mc="http://schemas.openxmlformats.org/markup-compatibility/2006" xmlns:r="http://schemas.openxmlformats.org/officeDocument/2006/relationships" xmlns:w="http://schemas.openxmlformats.org/wordprocessingml/2006/main" xmlns:w14="http://schemas.microsoft.com/office/word/2010/wordml" xmlns:w15="http://schemas.microsoft.com/office/word/2012/wordml" xmlns:w16cex="http://schemas.microsoft.com/office/word/2018/wordml/cex" xmlns:w16cid="http://schemas.microsoft.com/office/word/2016/wordml/cid" xmlns:w16="http://schemas.microsoft.com/office/word/2018/wordml" xmlns:w16du="http://schemas.microsoft.com/office/word/2023/wordml/word16du" xmlns:w16sdtdh="http://schemas.microsoft.com/office/word/2020/wordml/sdtdatahash" xmlns:w16sdtfl="http://schemas.microsoft.com/office/word/2024/wordml/sdtformatlock" xmlns:w16se="http://schemas.microsoft.com/office/word/2015/wordml/symex" mc:Ignorable="w14 w15 w16se w16cid w16 w16cex w16sdtdh w16sdtfl w16du">
   <w:docDefaults>
     <w:rPrDefault>
       <w:rPr>
@@ -2956,14 +2984,12 @@
 </file>
 
 <file path=customXml/item1.xml><?xml version="1.0" encoding="utf-8"?>
-<p:properties xmlns:p="http://schemas.microsoft.com/office/2006/metadata/properties" xmlns:xsi="http://www.w3.org/2001/XMLSchema-instance">
-  <documentManagement>
-    <c832ad60c1c34f65890c8681c782e92c xmlns="6e11c74b-62f6-44f6-994a-d452fb87adaa">
-      <Terms xmlns="http://schemas.microsoft.com/office/infopath/2007/PartnerControls"/>
-    </c832ad60c1c34f65890c8681c782e92c>
-    <TaxCatchAll xmlns="ccbf239a-0fec-4df3-9a33-399acea8c066"/>
-  </documentManagement>
-</p:properties>
+<?mso-contentType ?>
+<FormTemplates xmlns="http://schemas.microsoft.com/sharepoint/v3/contenttype/forms">
+  <Display>DocumentLibraryForm</Display>
+  <Edit>DocumentLibraryForm</Edit>
+  <New>DocumentLibraryForm</New>
+</FormTemplates>
 </file>
 
 <file path=customXml/item2.xml><?xml version="1.0" encoding="utf-8"?>
@@ -3172,21 +3198,20 @@
 </file>
 
 <file path=customXml/item3.xml><?xml version="1.0" encoding="utf-8"?>
-<?mso-contentType ?>
-<FormTemplates xmlns="http://schemas.microsoft.com/sharepoint/v3/contenttype/forms">
-  <Display>DocumentLibraryForm</Display>
-  <Edit>DocumentLibraryForm</Edit>
-  <New>DocumentLibraryForm</New>
-</FormTemplates>
+<p:properties xmlns:p="http://schemas.microsoft.com/office/2006/metadata/properties" xmlns:xsi="http://www.w3.org/2001/XMLSchema-instance">
+  <documentManagement>
+    <c832ad60c1c34f65890c8681c782e92c xmlns="6e11c74b-62f6-44f6-994a-d452fb87adaa">
+      <Terms xmlns="http://schemas.microsoft.com/office/infopath/2007/PartnerControls"/>
+    </c832ad60c1c34f65890c8681c782e92c>
+    <TaxCatchAll xmlns="ccbf239a-0fec-4df3-9a33-399acea8c066"/>
+  </documentManagement>
+</p:properties>
 </file>
 
 <file path=customXml/itemProps1.xml><?xml version="1.0" encoding="utf-8"?>
-<ds:datastoreItem xmlns:ds="http://schemas.openxmlformats.org/officeDocument/2006/customXml" ds:itemID="{FBB9B6FC-495C-4552-B8E5-48315AD77BC4}">
+<ds:datastoreItem xmlns:ds="http://schemas.openxmlformats.org/officeDocument/2006/customXml" ds:itemID="{C8AB2D80-6651-4ECC-90BC-6FA792918970}">
   <ds:schemaRefs>
-    <ds:schemaRef ds:uri="http://schemas.microsoft.com/office/2006/metadata/properties"/>
-    <ds:schemaRef ds:uri="6e11c74b-62f6-44f6-994a-d452fb87adaa"/>
-    <ds:schemaRef ds:uri="http://schemas.microsoft.com/office/infopath/2007/PartnerControls"/>
-    <ds:schemaRef ds:uri="ccbf239a-0fec-4df3-9a33-399acea8c066"/>
+    <ds:schemaRef ds:uri="http://schemas.microsoft.com/sharepoint/v3/contenttype/forms"/>
   </ds:schemaRefs>
 </ds:datastoreItem>
 </file>
@@ -3211,9 +3236,12 @@
 </file>
 
 <file path=customXml/itemProps3.xml><?xml version="1.0" encoding="utf-8"?>
-<ds:datastoreItem xmlns:ds="http://schemas.openxmlformats.org/officeDocument/2006/customXml" ds:itemID="{C8AB2D80-6651-4ECC-90BC-6FA792918970}">
+<ds:datastoreItem xmlns:ds="http://schemas.openxmlformats.org/officeDocument/2006/customXml" ds:itemID="{FBB9B6FC-495C-4552-B8E5-48315AD77BC4}">
   <ds:schemaRefs>
-    <ds:schemaRef ds:uri="http://schemas.microsoft.com/sharepoint/v3/contenttype/forms"/>
+    <ds:schemaRef ds:uri="http://schemas.microsoft.com/office/2006/metadata/properties"/>
+    <ds:schemaRef ds:uri="6e11c74b-62f6-44f6-994a-d452fb87adaa"/>
+    <ds:schemaRef ds:uri="http://schemas.microsoft.com/office/infopath/2007/PartnerControls"/>
+    <ds:schemaRef ds:uri="ccbf239a-0fec-4df3-9a33-399acea8c066"/>
   </ds:schemaRefs>
 </ds:datastoreItem>
 </file>
</xml_diff>